<commit_message>
feat: Implement model evaluation scripts for confusion matrix generation, F1 score calculation, and ensemble classification across various model priorities.
</commit_message>
<xml_diff>
--- a/priority_4_ensemble/ensemble_comparison_report.docx
+++ b/priority_4_ensemble/ensemble_comparison_report.docx
@@ -13,7 +13,7 @@
     </w:p>
     <w:p>
       <w:r>
-        <w:t>Generated: 2026-03-05 00:09:09</w:t>
+        <w:t>Generated: 2026-03-15 17:12:53</w:t>
       </w:r>
     </w:p>
     <w:p>
@@ -23,12 +23,12 @@
     </w:p>
     <w:p>
       <w:r>
-        <w:t>Frames sampled: [11436, 13154]</w:t>
+        <w:t>Frames sampled: [3813, 14431]</w:t>
       </w:r>
     </w:p>
     <w:p>
       <w:r>
-        <w:t>Total sperm crops: 31</w:t>
+        <w:t>Total sperm crops: 40</w:t>
       </w:r>
     </w:p>
     <w:p>
@@ -128,7 +128,7 @@
           </w:tcPr>
           <w:p>
             <w:r>
-              <w:t>12 (39%)</w:t>
+              <w:t>2 (5%)</w:t>
             </w:r>
           </w:p>
         </w:tc>
@@ -138,7 +138,7 @@
           </w:tcPr>
           <w:p>
             <w:r>
-              <w:t>11 (35%)</w:t>
+              <w:t>21 (52%)</w:t>
             </w:r>
           </w:p>
         </w:tc>
@@ -148,7 +148,7 @@
           </w:tcPr>
           <w:p>
             <w:r>
-              <w:t>9 (29%)</w:t>
+              <w:t>21 (52%)</w:t>
             </w:r>
           </w:p>
         </w:tc>
@@ -170,7 +170,7 @@
           </w:tcPr>
           <w:p>
             <w:r>
-              <w:t>7 (23%)</w:t>
+              <w:t>6 (15%)</w:t>
             </w:r>
           </w:p>
         </w:tc>
@@ -180,7 +180,7 @@
           </w:tcPr>
           <w:p>
             <w:r>
-              <w:t>2 (6%)</w:t>
+              <w:t>9 (22%)</w:t>
             </w:r>
           </w:p>
         </w:tc>
@@ -190,7 +190,7 @@
           </w:tcPr>
           <w:p>
             <w:r>
-              <w:t>3 (10%)</w:t>
+              <w:t>9 (22%)</w:t>
             </w:r>
           </w:p>
         </w:tc>
@@ -222,7 +222,7 @@
           </w:tcPr>
           <w:p>
             <w:r>
-              <w:t>4 (13%)</w:t>
+              <w:t>0 (0%)</w:t>
             </w:r>
           </w:p>
         </w:tc>
@@ -232,7 +232,7 @@
           </w:tcPr>
           <w:p>
             <w:r>
-              <w:t>2 (6%)</w:t>
+              <w:t>0 (0%)</w:t>
             </w:r>
           </w:p>
         </w:tc>
@@ -254,7 +254,7 @@
           </w:tcPr>
           <w:p>
             <w:r>
-              <w:t>11 (35%)</w:t>
+              <w:t>26 (65%)</w:t>
             </w:r>
           </w:p>
         </w:tc>
@@ -264,7 +264,7 @@
           </w:tcPr>
           <w:p>
             <w:r>
-              <w:t>4 (13%)</w:t>
+              <w:t>10 (25%)</w:t>
             </w:r>
           </w:p>
         </w:tc>
@@ -274,7 +274,7 @@
           </w:tcPr>
           <w:p>
             <w:r>
-              <w:t>9 (29%)</w:t>
+              <w:t>10 (25%)</w:t>
             </w:r>
           </w:p>
         </w:tc>
@@ -296,7 +296,7 @@
           </w:tcPr>
           <w:p>
             <w:r>
-              <w:t>1 (3%)</w:t>
+              <w:t>6 (15%)</w:t>
             </w:r>
           </w:p>
         </w:tc>
@@ -306,7 +306,7 @@
           </w:tcPr>
           <w:p>
             <w:r>
-              <w:t>10 (32%)</w:t>
+              <w:t>0 (0%)</w:t>
             </w:r>
           </w:p>
         </w:tc>
@@ -316,7 +316,7 @@
           </w:tcPr>
           <w:p>
             <w:r>
-              <w:t>8 (26%)</w:t>
+              <w:t>0 (0%)</w:t>
             </w:r>
           </w:p>
         </w:tc>
@@ -409,7 +409,7 @@
           </w:tcPr>
           <w:p>
             <w:r>
-              <w:t>78.6%</w:t>
+              <w:t>57.9%</w:t>
             </w:r>
           </w:p>
         </w:tc>
@@ -419,7 +419,7 @@
           </w:tcPr>
           <w:p>
             <w:r>
-              <w:t>59.9%</w:t>
+              <w:t>75.2%</w:t>
             </w:r>
           </w:p>
         </w:tc>
@@ -429,7 +429,7 @@
           </w:tcPr>
           <w:p>
             <w:r>
-              <w:t>52.7%</w:t>
+              <w:t>57.4%</w:t>
             </w:r>
           </w:p>
         </w:tc>
@@ -569,7 +569,7 @@
           </w:tcPr>
           <w:p>
             <w:r>
-              <w:t>11436</w:t>
+              <w:t>3813</w:t>
             </w:r>
           </w:p>
         </w:tc>
@@ -589,37 +589,37 @@
           </w:tcPr>
           <w:p>
             <w:r>
-              <w:t>Combined_Anomaly (92%)</w:t>
-            </w:r>
-          </w:p>
-        </w:tc>
-        <w:tc>
-          <w:tcPr>
-            <w:tcW w:type="dxa" w:w="1234"/>
-          </w:tcPr>
-          <w:p>
-            <w:r>
-              <w:t>Combined_Anomaly (74%)</w:t>
-            </w:r>
-          </w:p>
-        </w:tc>
-        <w:tc>
-          <w:tcPr>
-            <w:tcW w:type="dxa" w:w="1234"/>
-          </w:tcPr>
-          <w:p>
-            <w:r>
-              <w:t>Combined_Anomaly</w:t>
-            </w:r>
-          </w:p>
-        </w:tc>
-        <w:tc>
-          <w:tcPr>
-            <w:tcW w:type="dxa" w:w="1234"/>
-          </w:tcPr>
-          <w:p>
-            <w:r>
-              <w:t>81.4%</w:t>
+              <w:t>Tail_Anomaly (84%)</w:t>
+            </w:r>
+          </w:p>
+        </w:tc>
+        <w:tc>
+          <w:tcPr>
+            <w:tcW w:type="dxa" w:w="1234"/>
+          </w:tcPr>
+          <w:p>
+            <w:r>
+              <w:t>Head_Anomaly (60%)</w:t>
+            </w:r>
+          </w:p>
+        </w:tc>
+        <w:tc>
+          <w:tcPr>
+            <w:tcW w:type="dxa" w:w="1234"/>
+          </w:tcPr>
+          <w:p>
+            <w:r>
+              <w:t>Head_Anomaly</w:t>
+            </w:r>
+          </w:p>
+        </w:tc>
+        <w:tc>
+          <w:tcPr>
+            <w:tcW w:type="dxa" w:w="1234"/>
+          </w:tcPr>
+          <w:p>
+            <w:r>
+              <w:t>36.6%</w:t>
             </w:r>
           </w:p>
         </w:tc>
@@ -641,7 +641,7 @@
           </w:tcPr>
           <w:p>
             <w:r>
-              <w:t>11436</w:t>
+              <w:t>3813</w:t>
             </w:r>
           </w:p>
         </w:tc>
@@ -661,37 +661,37 @@
           </w:tcPr>
           <w:p>
             <w:r>
-              <w:t>Normal (75%)</w:t>
-            </w:r>
-          </w:p>
-        </w:tc>
-        <w:tc>
-          <w:tcPr>
-            <w:tcW w:type="dxa" w:w="1234"/>
-          </w:tcPr>
-          <w:p>
-            <w:r>
-              <w:t>Normal (29%)</w:t>
-            </w:r>
-          </w:p>
-        </w:tc>
-        <w:tc>
-          <w:tcPr>
-            <w:tcW w:type="dxa" w:w="1234"/>
-          </w:tcPr>
-          <w:p>
-            <w:r>
-              <w:t>Normal</w:t>
-            </w:r>
-          </w:p>
-        </w:tc>
-        <w:tc>
-          <w:tcPr>
-            <w:tcW w:type="dxa" w:w="1234"/>
-          </w:tcPr>
-          <w:p>
-            <w:r>
-              <w:t>47.3%</w:t>
+              <w:t>Head_Anomaly (68%)</w:t>
+            </w:r>
+          </w:p>
+        </w:tc>
+        <w:tc>
+          <w:tcPr>
+            <w:tcW w:type="dxa" w:w="1234"/>
+          </w:tcPr>
+          <w:p>
+            <w:r>
+              <w:t>Head_Anomaly (91%)</w:t>
+            </w:r>
+          </w:p>
+        </w:tc>
+        <w:tc>
+          <w:tcPr>
+            <w:tcW w:type="dxa" w:w="1234"/>
+          </w:tcPr>
+          <w:p>
+            <w:r>
+              <w:t>Head_Anomaly</w:t>
+            </w:r>
+          </w:p>
+        </w:tc>
+        <w:tc>
+          <w:tcPr>
+            <w:tcW w:type="dxa" w:w="1234"/>
+          </w:tcPr>
+          <w:p>
+            <w:r>
+              <w:t>81.9%</w:t>
             </w:r>
           </w:p>
         </w:tc>
@@ -713,7 +713,7 @@
           </w:tcPr>
           <w:p>
             <w:r>
-              <w:t>11436</w:t>
+              <w:t>3813</w:t>
             </w:r>
           </w:p>
         </w:tc>
@@ -733,37 +733,37 @@
           </w:tcPr>
           <w:p>
             <w:r>
-              <w:t>Normal (92%)</w:t>
-            </w:r>
-          </w:p>
-        </w:tc>
-        <w:tc>
-          <w:tcPr>
-            <w:tcW w:type="dxa" w:w="1234"/>
-          </w:tcPr>
-          <w:p>
-            <w:r>
-              <w:t>Combined_Anomaly (43%)</w:t>
-            </w:r>
-          </w:p>
-        </w:tc>
-        <w:tc>
-          <w:tcPr>
-            <w:tcW w:type="dxa" w:w="1234"/>
-          </w:tcPr>
-          <w:p>
-            <w:r>
-              <w:t>Normal</w:t>
-            </w:r>
-          </w:p>
-        </w:tc>
-        <w:tc>
-          <w:tcPr>
-            <w:tcW w:type="dxa" w:w="1234"/>
-          </w:tcPr>
-          <w:p>
-            <w:r>
-              <w:t>43.9%</w:t>
+              <w:t>Head_Anomaly (41%)</w:t>
+            </w:r>
+          </w:p>
+        </w:tc>
+        <w:tc>
+          <w:tcPr>
+            <w:tcW w:type="dxa" w:w="1234"/>
+          </w:tcPr>
+          <w:p>
+            <w:r>
+              <w:t>Head_Anomaly (99%)</w:t>
+            </w:r>
+          </w:p>
+        </w:tc>
+        <w:tc>
+          <w:tcPr>
+            <w:tcW w:type="dxa" w:w="1234"/>
+          </w:tcPr>
+          <w:p>
+            <w:r>
+              <w:t>Head_Anomaly</w:t>
+            </w:r>
+          </w:p>
+        </w:tc>
+        <w:tc>
+          <w:tcPr>
+            <w:tcW w:type="dxa" w:w="1234"/>
+          </w:tcPr>
+          <w:p>
+            <w:r>
+              <w:t>76.2%</w:t>
             </w:r>
           </w:p>
         </w:tc>
@@ -785,7 +785,7 @@
           </w:tcPr>
           <w:p>
             <w:r>
-              <w:t>11436</w:t>
+              <w:t>3813</w:t>
             </w:r>
           </w:p>
         </w:tc>
@@ -805,17 +805,17 @@
           </w:tcPr>
           <w:p>
             <w:r>
-              <w:t>Head_Anomaly (93%)</w:t>
-            </w:r>
-          </w:p>
-        </w:tc>
-        <w:tc>
-          <w:tcPr>
-            <w:tcW w:type="dxa" w:w="1234"/>
-          </w:tcPr>
-          <w:p>
-            <w:r>
-              <w:t>Combined_Anomaly (46%)</w:t>
+              <w:t>Tail_Anomaly (76%)</w:t>
+            </w:r>
+          </w:p>
+        </w:tc>
+        <w:tc>
+          <w:tcPr>
+            <w:tcW w:type="dxa" w:w="1234"/>
+          </w:tcPr>
+          <w:p>
+            <w:r>
+              <w:t>Head_Anomaly (52%)</w:t>
             </w:r>
           </w:p>
         </w:tc>
@@ -835,7 +835,7 @@
           </w:tcPr>
           <w:p>
             <w:r>
-              <w:t>53.7%</w:t>
+              <w:t>32.1%</w:t>
             </w:r>
           </w:p>
         </w:tc>
@@ -857,7 +857,7 @@
           </w:tcPr>
           <w:p>
             <w:r>
-              <w:t>11436</w:t>
+              <w:t>3813</w:t>
             </w:r>
           </w:p>
         </w:tc>
@@ -877,37 +877,37 @@
           </w:tcPr>
           <w:p>
             <w:r>
-              <w:t>Combined_Anomaly (56%)</w:t>
-            </w:r>
-          </w:p>
-        </w:tc>
-        <w:tc>
-          <w:tcPr>
-            <w:tcW w:type="dxa" w:w="1234"/>
-          </w:tcPr>
-          <w:p>
-            <w:r>
-              <w:t>Midpiece_Anomaly (92%)</w:t>
-            </w:r>
-          </w:p>
-        </w:tc>
-        <w:tc>
-          <w:tcPr>
-            <w:tcW w:type="dxa" w:w="1234"/>
-          </w:tcPr>
-          <w:p>
-            <w:r>
-              <w:t>Midpiece_Anomaly</w:t>
-            </w:r>
-          </w:p>
-        </w:tc>
-        <w:tc>
-          <w:tcPr>
-            <w:tcW w:type="dxa" w:w="1234"/>
-          </w:tcPr>
-          <w:p>
-            <w:r>
-              <w:t>55.3%</w:t>
+              <w:t>Normal (45%)</w:t>
+            </w:r>
+          </w:p>
+        </w:tc>
+        <w:tc>
+          <w:tcPr>
+            <w:tcW w:type="dxa" w:w="1234"/>
+          </w:tcPr>
+          <w:p>
+            <w:r>
+              <w:t>Combined_Anomaly (98%)</w:t>
+            </w:r>
+          </w:p>
+        </w:tc>
+        <w:tc>
+          <w:tcPr>
+            <w:tcW w:type="dxa" w:w="1234"/>
+          </w:tcPr>
+          <w:p>
+            <w:r>
+              <w:t>Combined_Anomaly</w:t>
+            </w:r>
+          </w:p>
+        </w:tc>
+        <w:tc>
+          <w:tcPr>
+            <w:tcW w:type="dxa" w:w="1234"/>
+          </w:tcPr>
+          <w:p>
+            <w:r>
+              <w:t>66.3%</w:t>
             </w:r>
           </w:p>
         </w:tc>
@@ -929,7 +929,7 @@
           </w:tcPr>
           <w:p>
             <w:r>
-              <w:t>11436</w:t>
+              <w:t>3813</w:t>
             </w:r>
           </w:p>
         </w:tc>
@@ -949,17 +949,17 @@
           </w:tcPr>
           <w:p>
             <w:r>
-              <w:t>Combined_Anomaly (81%)</w:t>
-            </w:r>
-          </w:p>
-        </w:tc>
-        <w:tc>
-          <w:tcPr>
-            <w:tcW w:type="dxa" w:w="1234"/>
-          </w:tcPr>
-          <w:p>
-            <w:r>
-              <w:t>Midpiece_Anomaly (47%)</w:t>
+              <w:t>Normal (40%)</w:t>
+            </w:r>
+          </w:p>
+        </w:tc>
+        <w:tc>
+          <w:tcPr>
+            <w:tcW w:type="dxa" w:w="1234"/>
+          </w:tcPr>
+          <w:p>
+            <w:r>
+              <w:t>Combined_Anomaly (95%)</w:t>
             </w:r>
           </w:p>
         </w:tc>
@@ -979,7 +979,7 @@
           </w:tcPr>
           <w:p>
             <w:r>
-              <w:t>36.1%</w:t>
+              <w:t>65.8%</w:t>
             </w:r>
           </w:p>
         </w:tc>
@@ -1001,7 +1001,7 @@
           </w:tcPr>
           <w:p>
             <w:r>
-              <w:t>11436</w:t>
+              <w:t>3813</w:t>
             </w:r>
           </w:p>
         </w:tc>
@@ -1021,37 +1021,37 @@
           </w:tcPr>
           <w:p>
             <w:r>
-              <w:t>Normal (63%)</w:t>
-            </w:r>
-          </w:p>
-        </w:tc>
-        <w:tc>
-          <w:tcPr>
-            <w:tcW w:type="dxa" w:w="1234"/>
-          </w:tcPr>
-          <w:p>
-            <w:r>
-              <w:t>Tail_Anomaly (97%)</w:t>
-            </w:r>
-          </w:p>
-        </w:tc>
-        <w:tc>
-          <w:tcPr>
-            <w:tcW w:type="dxa" w:w="1234"/>
-          </w:tcPr>
-          <w:p>
-            <w:r>
-              <w:t>Tail_Anomaly</w:t>
-            </w:r>
-          </w:p>
-        </w:tc>
-        <w:tc>
-          <w:tcPr>
-            <w:tcW w:type="dxa" w:w="1234"/>
-          </w:tcPr>
-          <w:p>
-            <w:r>
-              <w:t>58.2%</w:t>
+              <w:t>Normal (49%)</w:t>
+            </w:r>
+          </w:p>
+        </w:tc>
+        <w:tc>
+          <w:tcPr>
+            <w:tcW w:type="dxa" w:w="1234"/>
+          </w:tcPr>
+          <w:p>
+            <w:r>
+              <w:t>Combined_Anomaly (99%)</w:t>
+            </w:r>
+          </w:p>
+        </w:tc>
+        <w:tc>
+          <w:tcPr>
+            <w:tcW w:type="dxa" w:w="1234"/>
+          </w:tcPr>
+          <w:p>
+            <w:r>
+              <w:t>Combined_Anomaly</w:t>
+            </w:r>
+          </w:p>
+        </w:tc>
+        <w:tc>
+          <w:tcPr>
+            <w:tcW w:type="dxa" w:w="1234"/>
+          </w:tcPr>
+          <w:p>
+            <w:r>
+              <w:t>78.4%</w:t>
             </w:r>
           </w:p>
         </w:tc>
@@ -1073,7 +1073,7 @@
           </w:tcPr>
           <w:p>
             <w:r>
-              <w:t>11436</w:t>
+              <w:t>3813</w:t>
             </w:r>
           </w:p>
         </w:tc>
@@ -1093,17 +1093,17 @@
           </w:tcPr>
           <w:p>
             <w:r>
-              <w:t>Normal (87%)</w:t>
-            </w:r>
-          </w:p>
-        </w:tc>
-        <w:tc>
-          <w:tcPr>
-            <w:tcW w:type="dxa" w:w="1234"/>
-          </w:tcPr>
-          <w:p>
-            <w:r>
-              <w:t>Combined_Anomaly (37%)</w:t>
+              <w:t>Head_Anomaly (39%)</w:t>
+            </w:r>
+          </w:p>
+        </w:tc>
+        <w:tc>
+          <w:tcPr>
+            <w:tcW w:type="dxa" w:w="1234"/>
+          </w:tcPr>
+          <w:p>
+            <w:r>
+              <w:t>Normal (95%)</w:t>
             </w:r>
           </w:p>
         </w:tc>
@@ -1123,7 +1123,7 @@
           </w:tcPr>
           <w:p>
             <w:r>
-              <w:t>52.0%</w:t>
+              <w:t>71.3%</w:t>
             </w:r>
           </w:p>
         </w:tc>
@@ -1145,7 +1145,7 @@
           </w:tcPr>
           <w:p>
             <w:r>
-              <w:t>11436</w:t>
+              <w:t>3813</w:t>
             </w:r>
           </w:p>
         </w:tc>
@@ -1165,17 +1165,17 @@
           </w:tcPr>
           <w:p>
             <w:r>
-              <w:t>Combined_Anomaly (93%)</w:t>
-            </w:r>
-          </w:p>
-        </w:tc>
-        <w:tc>
-          <w:tcPr>
-            <w:tcW w:type="dxa" w:w="1234"/>
-          </w:tcPr>
-          <w:p>
-            <w:r>
-              <w:t>Combined_Anomaly (62%)</w:t>
+              <w:t>Normal (56%)</w:t>
+            </w:r>
+          </w:p>
+        </w:tc>
+        <w:tc>
+          <w:tcPr>
+            <w:tcW w:type="dxa" w:w="1234"/>
+          </w:tcPr>
+          <w:p>
+            <w:r>
+              <w:t>Combined_Anomaly (65%)</w:t>
             </w:r>
           </w:p>
         </w:tc>
@@ -1195,7 +1195,7 @@
           </w:tcPr>
           <w:p>
             <w:r>
-              <w:t>74.5%</w:t>
+              <w:t>49.0%</w:t>
             </w:r>
           </w:p>
         </w:tc>
@@ -1217,7 +1217,7 @@
           </w:tcPr>
           <w:p>
             <w:r>
-              <w:t>11436</w:t>
+              <w:t>3813</w:t>
             </w:r>
           </w:p>
         </w:tc>
@@ -1237,37 +1237,37 @@
           </w:tcPr>
           <w:p>
             <w:r>
-              <w:t>Head_Anomaly (79%)</w:t>
-            </w:r>
-          </w:p>
-        </w:tc>
-        <w:tc>
-          <w:tcPr>
-            <w:tcW w:type="dxa" w:w="1234"/>
-          </w:tcPr>
-          <w:p>
-            <w:r>
-              <w:t>Tail_Anomaly (84%)</w:t>
-            </w:r>
-          </w:p>
-        </w:tc>
-        <w:tc>
-          <w:tcPr>
-            <w:tcW w:type="dxa" w:w="1234"/>
-          </w:tcPr>
-          <w:p>
-            <w:r>
-              <w:t>Tail_Anomaly</w:t>
-            </w:r>
-          </w:p>
-        </w:tc>
-        <w:tc>
-          <w:tcPr>
-            <w:tcW w:type="dxa" w:w="1234"/>
-          </w:tcPr>
-          <w:p>
-            <w:r>
-              <w:t>58.5%</w:t>
+              <w:t>Tail_Anomaly (83%)</w:t>
+            </w:r>
+          </w:p>
+        </w:tc>
+        <w:tc>
+          <w:tcPr>
+            <w:tcW w:type="dxa" w:w="1234"/>
+          </w:tcPr>
+          <w:p>
+            <w:r>
+              <w:t>Combined_Anomaly (100%)</w:t>
+            </w:r>
+          </w:p>
+        </w:tc>
+        <w:tc>
+          <w:tcPr>
+            <w:tcW w:type="dxa" w:w="1234"/>
+          </w:tcPr>
+          <w:p>
+            <w:r>
+              <w:t>Combined_Anomaly</w:t>
+            </w:r>
+          </w:p>
+        </w:tc>
+        <w:tc>
+          <w:tcPr>
+            <w:tcW w:type="dxa" w:w="1234"/>
+          </w:tcPr>
+          <w:p>
+            <w:r>
+              <w:t>63.2%</w:t>
             </w:r>
           </w:p>
         </w:tc>
@@ -1289,7 +1289,7 @@
           </w:tcPr>
           <w:p>
             <w:r>
-              <w:t>11436</w:t>
+              <w:t>3813</w:t>
             </w:r>
           </w:p>
         </w:tc>
@@ -1309,37 +1309,37 @@
           </w:tcPr>
           <w:p>
             <w:r>
-              <w:t>Normal (74%)</w:t>
-            </w:r>
-          </w:p>
-        </w:tc>
-        <w:tc>
-          <w:tcPr>
-            <w:tcW w:type="dxa" w:w="1234"/>
-          </w:tcPr>
-          <w:p>
-            <w:r>
-              <w:t>Midpiece_Anomaly (34%)</w:t>
-            </w:r>
-          </w:p>
-        </w:tc>
-        <w:tc>
-          <w:tcPr>
-            <w:tcW w:type="dxa" w:w="1234"/>
-          </w:tcPr>
-          <w:p>
-            <w:r>
-              <w:t>Normal</w:t>
-            </w:r>
-          </w:p>
-        </w:tc>
-        <w:tc>
-          <w:tcPr>
-            <w:tcW w:type="dxa" w:w="1234"/>
-          </w:tcPr>
-          <w:p>
-            <w:r>
-              <w:t>49.6%</w:t>
+              <w:t>Normal (87%)</w:t>
+            </w:r>
+          </w:p>
+        </w:tc>
+        <w:tc>
+          <w:tcPr>
+            <w:tcW w:type="dxa" w:w="1234"/>
+          </w:tcPr>
+          <w:p>
+            <w:r>
+              <w:t>Combined_Anomaly (59%)</w:t>
+            </w:r>
+          </w:p>
+        </w:tc>
+        <w:tc>
+          <w:tcPr>
+            <w:tcW w:type="dxa" w:w="1234"/>
+          </w:tcPr>
+          <w:p>
+            <w:r>
+              <w:t>Combined_Anomaly</w:t>
+            </w:r>
+          </w:p>
+        </w:tc>
+        <w:tc>
+          <w:tcPr>
+            <w:tcW w:type="dxa" w:w="1234"/>
+          </w:tcPr>
+          <w:p>
+            <w:r>
+              <w:t>39.9%</w:t>
             </w:r>
           </w:p>
         </w:tc>
@@ -1361,7 +1361,7 @@
           </w:tcPr>
           <w:p>
             <w:r>
-              <w:t>11436</w:t>
+              <w:t>3813</w:t>
             </w:r>
           </w:p>
         </w:tc>
@@ -1381,37 +1381,37 @@
           </w:tcPr>
           <w:p>
             <w:r>
-              <w:t>Combined_Anomaly (90%)</w:t>
-            </w:r>
-          </w:p>
-        </w:tc>
-        <w:tc>
-          <w:tcPr>
-            <w:tcW w:type="dxa" w:w="1234"/>
-          </w:tcPr>
-          <w:p>
-            <w:r>
-              <w:t>Tail_Anomaly (48%)</w:t>
-            </w:r>
-          </w:p>
-        </w:tc>
-        <w:tc>
-          <w:tcPr>
-            <w:tcW w:type="dxa" w:w="1234"/>
-          </w:tcPr>
-          <w:p>
-            <w:r>
-              <w:t>Combined_Anomaly</w:t>
-            </w:r>
-          </w:p>
-        </w:tc>
-        <w:tc>
-          <w:tcPr>
-            <w:tcW w:type="dxa" w:w="1234"/>
-          </w:tcPr>
-          <w:p>
-            <w:r>
-              <w:t>59.3%</w:t>
+              <w:t>Normal (44%)</w:t>
+            </w:r>
+          </w:p>
+        </w:tc>
+        <w:tc>
+          <w:tcPr>
+            <w:tcW w:type="dxa" w:w="1234"/>
+          </w:tcPr>
+          <w:p>
+            <w:r>
+              <w:t>Normal (45%)</w:t>
+            </w:r>
+          </w:p>
+        </w:tc>
+        <w:tc>
+          <w:tcPr>
+            <w:tcW w:type="dxa" w:w="1234"/>
+          </w:tcPr>
+          <w:p>
+            <w:r>
+              <w:t>Normal</w:t>
+            </w:r>
+          </w:p>
+        </w:tc>
+        <w:tc>
+          <w:tcPr>
+            <w:tcW w:type="dxa" w:w="1234"/>
+          </w:tcPr>
+          <w:p>
+            <w:r>
+              <w:t>44.3%</w:t>
             </w:r>
           </w:p>
         </w:tc>
@@ -1433,7 +1433,7 @@
           </w:tcPr>
           <w:p>
             <w:r>
-              <w:t>11436</w:t>
+              <w:t>3813</w:t>
             </w:r>
           </w:p>
         </w:tc>
@@ -1453,37 +1453,37 @@
           </w:tcPr>
           <w:p>
             <w:r>
-              <w:t>Combined_Anomaly (73%)</w:t>
-            </w:r>
-          </w:p>
-        </w:tc>
-        <w:tc>
-          <w:tcPr>
-            <w:tcW w:type="dxa" w:w="1234"/>
-          </w:tcPr>
-          <w:p>
-            <w:r>
-              <w:t>Combined_Anomaly (50%)</w:t>
-            </w:r>
-          </w:p>
-        </w:tc>
-        <w:tc>
-          <w:tcPr>
-            <w:tcW w:type="dxa" w:w="1234"/>
-          </w:tcPr>
-          <w:p>
-            <w:r>
-              <w:t>Combined_Anomaly</w:t>
-            </w:r>
-          </w:p>
-        </w:tc>
-        <w:tc>
-          <w:tcPr>
-            <w:tcW w:type="dxa" w:w="1234"/>
-          </w:tcPr>
-          <w:p>
-            <w:r>
-              <w:t>59.4%</w:t>
+              <w:t>Combined_Anomaly (43%)</w:t>
+            </w:r>
+          </w:p>
+        </w:tc>
+        <w:tc>
+          <w:tcPr>
+            <w:tcW w:type="dxa" w:w="1234"/>
+          </w:tcPr>
+          <w:p>
+            <w:r>
+              <w:t>Head_Anomaly (58%)</w:t>
+            </w:r>
+          </w:p>
+        </w:tc>
+        <w:tc>
+          <w:tcPr>
+            <w:tcW w:type="dxa" w:w="1234"/>
+          </w:tcPr>
+          <w:p>
+            <w:r>
+              <w:t>Head_Anomaly</w:t>
+            </w:r>
+          </w:p>
+        </w:tc>
+        <w:tc>
+          <w:tcPr>
+            <w:tcW w:type="dxa" w:w="1234"/>
+          </w:tcPr>
+          <w:p>
+            <w:r>
+              <w:t>48.2%</w:t>
             </w:r>
           </w:p>
         </w:tc>
@@ -1505,7 +1505,7 @@
           </w:tcPr>
           <w:p>
             <w:r>
-              <w:t>11436</w:t>
+              <w:t>3813</w:t>
             </w:r>
           </w:p>
         </w:tc>
@@ -1525,17 +1525,17 @@
           </w:tcPr>
           <w:p>
             <w:r>
-              <w:t>Combined_Anomaly (94%)</w:t>
-            </w:r>
-          </w:p>
-        </w:tc>
-        <w:tc>
-          <w:tcPr>
-            <w:tcW w:type="dxa" w:w="1234"/>
-          </w:tcPr>
-          <w:p>
-            <w:r>
-              <w:t>Combined_Anomaly (69%)</w:t>
+              <w:t>Tail_Anomaly (88%)</w:t>
+            </w:r>
+          </w:p>
+        </w:tc>
+        <w:tc>
+          <w:tcPr>
+            <w:tcW w:type="dxa" w:w="1234"/>
+          </w:tcPr>
+          <w:p>
+            <w:r>
+              <w:t>Combined_Anomaly (76%)</w:t>
             </w:r>
           </w:p>
         </w:tc>
@@ -1555,7 +1555,7 @@
           </w:tcPr>
           <w:p>
             <w:r>
-              <w:t>78.8%</w:t>
+              <w:t>47.5%</w:t>
             </w:r>
           </w:p>
         </w:tc>
@@ -1577,7 +1577,7 @@
           </w:tcPr>
           <w:p>
             <w:r>
-              <w:t>11436</w:t>
+              <w:t>3813</w:t>
             </w:r>
           </w:p>
         </w:tc>
@@ -1597,37 +1597,37 @@
           </w:tcPr>
           <w:p>
             <w:r>
-              <w:t>Head_Anomaly (79%)</w:t>
-            </w:r>
-          </w:p>
-        </w:tc>
-        <w:tc>
-          <w:tcPr>
-            <w:tcW w:type="dxa" w:w="1234"/>
-          </w:tcPr>
-          <w:p>
-            <w:r>
-              <w:t>Tail_Anomaly (97%)</w:t>
-            </w:r>
-          </w:p>
-        </w:tc>
-        <w:tc>
-          <w:tcPr>
-            <w:tcW w:type="dxa" w:w="1234"/>
-          </w:tcPr>
-          <w:p>
-            <w:r>
-              <w:t>Tail_Anomaly</w:t>
-            </w:r>
-          </w:p>
-        </w:tc>
-        <w:tc>
-          <w:tcPr>
-            <w:tcW w:type="dxa" w:w="1234"/>
-          </w:tcPr>
-          <w:p>
-            <w:r>
-              <w:t>58.6%</w:t>
+              <w:t>Normal (58%)</w:t>
+            </w:r>
+          </w:p>
+        </w:tc>
+        <w:tc>
+          <w:tcPr>
+            <w:tcW w:type="dxa" w:w="1234"/>
+          </w:tcPr>
+          <w:p>
+            <w:r>
+              <w:t>Combined_Anomaly (47%)</w:t>
+            </w:r>
+          </w:p>
+        </w:tc>
+        <w:tc>
+          <w:tcPr>
+            <w:tcW w:type="dxa" w:w="1234"/>
+          </w:tcPr>
+          <w:p>
+            <w:r>
+              <w:t>Combined_Anomaly</w:t>
+            </w:r>
+          </w:p>
+        </w:tc>
+        <w:tc>
+          <w:tcPr>
+            <w:tcW w:type="dxa" w:w="1234"/>
+          </w:tcPr>
+          <w:p>
+            <w:r>
+              <w:t>43.0%</w:t>
             </w:r>
           </w:p>
         </w:tc>
@@ -1649,7 +1649,7 @@
           </w:tcPr>
           <w:p>
             <w:r>
-              <w:t>11436</w:t>
+              <w:t>3813</w:t>
             </w:r>
           </w:p>
         </w:tc>
@@ -1669,37 +1669,37 @@
           </w:tcPr>
           <w:p>
             <w:r>
-              <w:t>Combined_Anomaly (52%)</w:t>
-            </w:r>
-          </w:p>
-        </w:tc>
-        <w:tc>
-          <w:tcPr>
-            <w:tcW w:type="dxa" w:w="1234"/>
-          </w:tcPr>
-          <w:p>
-            <w:r>
-              <w:t>Combined_Anomaly (35%)</w:t>
-            </w:r>
-          </w:p>
-        </w:tc>
-        <w:tc>
-          <w:tcPr>
-            <w:tcW w:type="dxa" w:w="1234"/>
-          </w:tcPr>
-          <w:p>
-            <w:r>
-              <w:t>Combined_Anomaly</w:t>
-            </w:r>
-          </w:p>
-        </w:tc>
-        <w:tc>
-          <w:tcPr>
-            <w:tcW w:type="dxa" w:w="1234"/>
-          </w:tcPr>
-          <w:p>
-            <w:r>
-              <w:t>42.1%</w:t>
+              <w:t>Normal (62%)</w:t>
+            </w:r>
+          </w:p>
+        </w:tc>
+        <w:tc>
+          <w:tcPr>
+            <w:tcW w:type="dxa" w:w="1234"/>
+          </w:tcPr>
+          <w:p>
+            <w:r>
+              <w:t>Normal (61%)</w:t>
+            </w:r>
+          </w:p>
+        </w:tc>
+        <w:tc>
+          <w:tcPr>
+            <w:tcW w:type="dxa" w:w="1234"/>
+          </w:tcPr>
+          <w:p>
+            <w:r>
+              <w:t>Normal</w:t>
+            </w:r>
+          </w:p>
+        </w:tc>
+        <w:tc>
+          <w:tcPr>
+            <w:tcW w:type="dxa" w:w="1234"/>
+          </w:tcPr>
+          <w:p>
+            <w:r>
+              <w:t>61.6%</w:t>
             </w:r>
           </w:p>
         </w:tc>
@@ -1721,37 +1721,37 @@
           </w:tcPr>
           <w:p>
             <w:r>
-              <w:t>13154</w:t>
-            </w:r>
-          </w:p>
-        </w:tc>
-        <w:tc>
-          <w:tcPr>
-            <w:tcW w:type="dxa" w:w="1234"/>
-          </w:tcPr>
-          <w:p>
-            <w:r>
-              <w:t>#1</w:t>
-            </w:r>
-          </w:p>
-        </w:tc>
-        <w:tc>
-          <w:tcPr>
-            <w:tcW w:type="dxa" w:w="1234"/>
-          </w:tcPr>
-          <w:p>
-            <w:r>
-              <w:t>Normal (34%)</w:t>
-            </w:r>
-          </w:p>
-        </w:tc>
-        <w:tc>
-          <w:tcPr>
-            <w:tcW w:type="dxa" w:w="1234"/>
-          </w:tcPr>
-          <w:p>
-            <w:r>
-              <w:t>Normal (34%)</w:t>
+              <w:t>3813</w:t>
+            </w:r>
+          </w:p>
+        </w:tc>
+        <w:tc>
+          <w:tcPr>
+            <w:tcW w:type="dxa" w:w="1234"/>
+          </w:tcPr>
+          <w:p>
+            <w:r>
+              <w:t>#17</w:t>
+            </w:r>
+          </w:p>
+        </w:tc>
+        <w:tc>
+          <w:tcPr>
+            <w:tcW w:type="dxa" w:w="1234"/>
+          </w:tcPr>
+          <w:p>
+            <w:r>
+              <w:t>Normal (46%)</w:t>
+            </w:r>
+          </w:p>
+        </w:tc>
+        <w:tc>
+          <w:tcPr>
+            <w:tcW w:type="dxa" w:w="1234"/>
+          </w:tcPr>
+          <w:p>
+            <w:r>
+              <w:t>Normal (74%)</w:t>
             </w:r>
           </w:p>
         </w:tc>
@@ -1771,7 +1771,7 @@
           </w:tcPr>
           <w:p>
             <w:r>
-              <w:t>33.8%</w:t>
+              <w:t>62.8%</w:t>
             </w:r>
           </w:p>
         </w:tc>
@@ -1793,57 +1793,57 @@
           </w:tcPr>
           <w:p>
             <w:r>
-              <w:t>13154</w:t>
-            </w:r>
-          </w:p>
-        </w:tc>
-        <w:tc>
-          <w:tcPr>
-            <w:tcW w:type="dxa" w:w="1234"/>
-          </w:tcPr>
-          <w:p>
-            <w:r>
-              <w:t>#2</w:t>
-            </w:r>
-          </w:p>
-        </w:tc>
-        <w:tc>
-          <w:tcPr>
-            <w:tcW w:type="dxa" w:w="1234"/>
-          </w:tcPr>
-          <w:p>
-            <w:r>
-              <w:t>Head_Anomaly (78%)</w:t>
-            </w:r>
-          </w:p>
-        </w:tc>
-        <w:tc>
-          <w:tcPr>
-            <w:tcW w:type="dxa" w:w="1234"/>
-          </w:tcPr>
-          <w:p>
-            <w:r>
-              <w:t>Combined_Anomaly (30%)</w:t>
-            </w:r>
-          </w:p>
-        </w:tc>
-        <w:tc>
-          <w:tcPr>
-            <w:tcW w:type="dxa" w:w="1234"/>
-          </w:tcPr>
-          <w:p>
-            <w:r>
-              <w:t>Head_Anomaly</w:t>
-            </w:r>
-          </w:p>
-        </w:tc>
-        <w:tc>
-          <w:tcPr>
-            <w:tcW w:type="dxa" w:w="1234"/>
-          </w:tcPr>
-          <w:p>
-            <w:r>
-              <w:t>48.8%</w:t>
+              <w:t>14431</w:t>
+            </w:r>
+          </w:p>
+        </w:tc>
+        <w:tc>
+          <w:tcPr>
+            <w:tcW w:type="dxa" w:w="1234"/>
+          </w:tcPr>
+          <w:p>
+            <w:r>
+              <w:t>#1</w:t>
+            </w:r>
+          </w:p>
+        </w:tc>
+        <w:tc>
+          <w:tcPr>
+            <w:tcW w:type="dxa" w:w="1234"/>
+          </w:tcPr>
+          <w:p>
+            <w:r>
+              <w:t>Normal (39%)</w:t>
+            </w:r>
+          </w:p>
+        </w:tc>
+        <w:tc>
+          <w:tcPr>
+            <w:tcW w:type="dxa" w:w="1234"/>
+          </w:tcPr>
+          <w:p>
+            <w:r>
+              <w:t>Combined_Anomaly (92%)</w:t>
+            </w:r>
+          </w:p>
+        </w:tc>
+        <w:tc>
+          <w:tcPr>
+            <w:tcW w:type="dxa" w:w="1234"/>
+          </w:tcPr>
+          <w:p>
+            <w:r>
+              <w:t>Combined_Anomaly</w:t>
+            </w:r>
+          </w:p>
+        </w:tc>
+        <w:tc>
+          <w:tcPr>
+            <w:tcW w:type="dxa" w:w="1234"/>
+          </w:tcPr>
+          <w:p>
+            <w:r>
+              <w:t>68.6%</w:t>
             </w:r>
           </w:p>
         </w:tc>
@@ -1865,57 +1865,57 @@
           </w:tcPr>
           <w:p>
             <w:r>
-              <w:t>13154</w:t>
-            </w:r>
-          </w:p>
-        </w:tc>
-        <w:tc>
-          <w:tcPr>
-            <w:tcW w:type="dxa" w:w="1234"/>
-          </w:tcPr>
-          <w:p>
-            <w:r>
-              <w:t>#3</w:t>
-            </w:r>
-          </w:p>
-        </w:tc>
-        <w:tc>
-          <w:tcPr>
-            <w:tcW w:type="dxa" w:w="1234"/>
-          </w:tcPr>
-          <w:p>
-            <w:r>
-              <w:t>Head_Anomaly (46%)</w:t>
-            </w:r>
-          </w:p>
-        </w:tc>
-        <w:tc>
-          <w:tcPr>
-            <w:tcW w:type="dxa" w:w="1234"/>
-          </w:tcPr>
-          <w:p>
-            <w:r>
-              <w:t>Combined_Anomaly (80%)</w:t>
-            </w:r>
-          </w:p>
-        </w:tc>
-        <w:tc>
-          <w:tcPr>
-            <w:tcW w:type="dxa" w:w="1234"/>
-          </w:tcPr>
-          <w:p>
-            <w:r>
-              <w:t>Combined_Anomaly</w:t>
-            </w:r>
-          </w:p>
-        </w:tc>
-        <w:tc>
-          <w:tcPr>
-            <w:tcW w:type="dxa" w:w="1234"/>
-          </w:tcPr>
-          <w:p>
-            <w:r>
-              <w:t>63.0%</w:t>
+              <w:t>14431</w:t>
+            </w:r>
+          </w:p>
+        </w:tc>
+        <w:tc>
+          <w:tcPr>
+            <w:tcW w:type="dxa" w:w="1234"/>
+          </w:tcPr>
+          <w:p>
+            <w:r>
+              <w:t>#2</w:t>
+            </w:r>
+          </w:p>
+        </w:tc>
+        <w:tc>
+          <w:tcPr>
+            <w:tcW w:type="dxa" w:w="1234"/>
+          </w:tcPr>
+          <w:p>
+            <w:r>
+              <w:t>Normal (54%)</w:t>
+            </w:r>
+          </w:p>
+        </w:tc>
+        <w:tc>
+          <w:tcPr>
+            <w:tcW w:type="dxa" w:w="1234"/>
+          </w:tcPr>
+          <w:p>
+            <w:r>
+              <w:t>Normal (67%)</w:t>
+            </w:r>
+          </w:p>
+        </w:tc>
+        <w:tc>
+          <w:tcPr>
+            <w:tcW w:type="dxa" w:w="1234"/>
+          </w:tcPr>
+          <w:p>
+            <w:r>
+              <w:t>Normal</w:t>
+            </w:r>
+          </w:p>
+        </w:tc>
+        <w:tc>
+          <w:tcPr>
+            <w:tcW w:type="dxa" w:w="1234"/>
+          </w:tcPr>
+          <w:p>
+            <w:r>
+              <w:t>61.7%</w:t>
             </w:r>
           </w:p>
         </w:tc>
@@ -1937,57 +1937,57 @@
           </w:tcPr>
           <w:p>
             <w:r>
-              <w:t>13154</w:t>
-            </w:r>
-          </w:p>
-        </w:tc>
-        <w:tc>
-          <w:tcPr>
-            <w:tcW w:type="dxa" w:w="1234"/>
-          </w:tcPr>
-          <w:p>
-            <w:r>
-              <w:t>#4</w:t>
-            </w:r>
-          </w:p>
-        </w:tc>
-        <w:tc>
-          <w:tcPr>
-            <w:tcW w:type="dxa" w:w="1234"/>
-          </w:tcPr>
-          <w:p>
-            <w:r>
-              <w:t>Head_Anomaly (71%)</w:t>
-            </w:r>
-          </w:p>
-        </w:tc>
-        <w:tc>
-          <w:tcPr>
-            <w:tcW w:type="dxa" w:w="1234"/>
-          </w:tcPr>
-          <w:p>
-            <w:r>
-              <w:t>Midpiece_Anomaly (77%)</w:t>
-            </w:r>
-          </w:p>
-        </w:tc>
-        <w:tc>
-          <w:tcPr>
-            <w:tcW w:type="dxa" w:w="1234"/>
-          </w:tcPr>
-          <w:p>
-            <w:r>
-              <w:t>Midpiece_Anomaly</w:t>
-            </w:r>
-          </w:p>
-        </w:tc>
-        <w:tc>
-          <w:tcPr>
-            <w:tcW w:type="dxa" w:w="1234"/>
-          </w:tcPr>
-          <w:p>
-            <w:r>
-              <w:t>46.4%</w:t>
+              <w:t>14431</w:t>
+            </w:r>
+          </w:p>
+        </w:tc>
+        <w:tc>
+          <w:tcPr>
+            <w:tcW w:type="dxa" w:w="1234"/>
+          </w:tcPr>
+          <w:p>
+            <w:r>
+              <w:t>#3</w:t>
+            </w:r>
+          </w:p>
+        </w:tc>
+        <w:tc>
+          <w:tcPr>
+            <w:tcW w:type="dxa" w:w="1234"/>
+          </w:tcPr>
+          <w:p>
+            <w:r>
+              <w:t>Normal (71%)</w:t>
+            </w:r>
+          </w:p>
+        </w:tc>
+        <w:tc>
+          <w:tcPr>
+            <w:tcW w:type="dxa" w:w="1234"/>
+          </w:tcPr>
+          <w:p>
+            <w:r>
+              <w:t>Normal (83%)</w:t>
+            </w:r>
+          </w:p>
+        </w:tc>
+        <w:tc>
+          <w:tcPr>
+            <w:tcW w:type="dxa" w:w="1234"/>
+          </w:tcPr>
+          <w:p>
+            <w:r>
+              <w:t>Normal</w:t>
+            </w:r>
+          </w:p>
+        </w:tc>
+        <w:tc>
+          <w:tcPr>
+            <w:tcW w:type="dxa" w:w="1234"/>
+          </w:tcPr>
+          <w:p>
+            <w:r>
+              <w:t>77.9%</w:t>
             </w:r>
           </w:p>
         </w:tc>
@@ -2009,57 +2009,57 @@
           </w:tcPr>
           <w:p>
             <w:r>
-              <w:t>13154</w:t>
-            </w:r>
-          </w:p>
-        </w:tc>
-        <w:tc>
-          <w:tcPr>
-            <w:tcW w:type="dxa" w:w="1234"/>
-          </w:tcPr>
-          <w:p>
-            <w:r>
-              <w:t>#5</w:t>
-            </w:r>
-          </w:p>
-        </w:tc>
-        <w:tc>
-          <w:tcPr>
-            <w:tcW w:type="dxa" w:w="1234"/>
-          </w:tcPr>
-          <w:p>
-            <w:r>
-              <w:t>Normal (99%)</w:t>
-            </w:r>
-          </w:p>
-        </w:tc>
-        <w:tc>
-          <w:tcPr>
-            <w:tcW w:type="dxa" w:w="1234"/>
-          </w:tcPr>
-          <w:p>
-            <w:r>
-              <w:t>Tail_Anomaly (59%)</w:t>
-            </w:r>
-          </w:p>
-        </w:tc>
-        <w:tc>
-          <w:tcPr>
-            <w:tcW w:type="dxa" w:w="1234"/>
-          </w:tcPr>
-          <w:p>
-            <w:r>
-              <w:t>Normal</w:t>
-            </w:r>
-          </w:p>
-        </w:tc>
-        <w:tc>
-          <w:tcPr>
-            <w:tcW w:type="dxa" w:w="1234"/>
-          </w:tcPr>
-          <w:p>
-            <w:r>
-              <w:t>40.5%</w:t>
+              <w:t>14431</w:t>
+            </w:r>
+          </w:p>
+        </w:tc>
+        <w:tc>
+          <w:tcPr>
+            <w:tcW w:type="dxa" w:w="1234"/>
+          </w:tcPr>
+          <w:p>
+            <w:r>
+              <w:t>#4</w:t>
+            </w:r>
+          </w:p>
+        </w:tc>
+        <w:tc>
+          <w:tcPr>
+            <w:tcW w:type="dxa" w:w="1234"/>
+          </w:tcPr>
+          <w:p>
+            <w:r>
+              <w:t>Normal (87%)</w:t>
+            </w:r>
+          </w:p>
+        </w:tc>
+        <w:tc>
+          <w:tcPr>
+            <w:tcW w:type="dxa" w:w="1234"/>
+          </w:tcPr>
+          <w:p>
+            <w:r>
+              <w:t>Head_Anomaly (70%)</w:t>
+            </w:r>
+          </w:p>
+        </w:tc>
+        <w:tc>
+          <w:tcPr>
+            <w:tcW w:type="dxa" w:w="1234"/>
+          </w:tcPr>
+          <w:p>
+            <w:r>
+              <w:t>Head_Anomaly</w:t>
+            </w:r>
+          </w:p>
+        </w:tc>
+        <w:tc>
+          <w:tcPr>
+            <w:tcW w:type="dxa" w:w="1234"/>
+          </w:tcPr>
+          <w:p>
+            <w:r>
+              <w:t>42.2%</w:t>
             </w:r>
           </w:p>
         </w:tc>
@@ -2081,57 +2081,57 @@
           </w:tcPr>
           <w:p>
             <w:r>
-              <w:t>13154</w:t>
-            </w:r>
-          </w:p>
-        </w:tc>
-        <w:tc>
-          <w:tcPr>
-            <w:tcW w:type="dxa" w:w="1234"/>
-          </w:tcPr>
-          <w:p>
-            <w:r>
-              <w:t>#6</w:t>
-            </w:r>
-          </w:p>
-        </w:tc>
-        <w:tc>
-          <w:tcPr>
-            <w:tcW w:type="dxa" w:w="1234"/>
-          </w:tcPr>
-          <w:p>
-            <w:r>
-              <w:t>Normal (99%)</w:t>
-            </w:r>
-          </w:p>
-        </w:tc>
-        <w:tc>
-          <w:tcPr>
-            <w:tcW w:type="dxa" w:w="1234"/>
-          </w:tcPr>
-          <w:p>
-            <w:r>
-              <w:t>Normal (35%)</w:t>
-            </w:r>
-          </w:p>
-        </w:tc>
-        <w:tc>
-          <w:tcPr>
-            <w:tcW w:type="dxa" w:w="1234"/>
-          </w:tcPr>
-          <w:p>
-            <w:r>
-              <w:t>Normal</w:t>
-            </w:r>
-          </w:p>
-        </w:tc>
-        <w:tc>
-          <w:tcPr>
-            <w:tcW w:type="dxa" w:w="1234"/>
-          </w:tcPr>
-          <w:p>
-            <w:r>
-              <w:t>61.1%</w:t>
+              <w:t>14431</w:t>
+            </w:r>
+          </w:p>
+        </w:tc>
+        <w:tc>
+          <w:tcPr>
+            <w:tcW w:type="dxa" w:w="1234"/>
+          </w:tcPr>
+          <w:p>
+            <w:r>
+              <w:t>#5</w:t>
+            </w:r>
+          </w:p>
+        </w:tc>
+        <w:tc>
+          <w:tcPr>
+            <w:tcW w:type="dxa" w:w="1234"/>
+          </w:tcPr>
+          <w:p>
+            <w:r>
+              <w:t>Tail_Anomaly (76%)</w:t>
+            </w:r>
+          </w:p>
+        </w:tc>
+        <w:tc>
+          <w:tcPr>
+            <w:tcW w:type="dxa" w:w="1234"/>
+          </w:tcPr>
+          <w:p>
+            <w:r>
+              <w:t>Combined_Anomaly (72%)</w:t>
+            </w:r>
+          </w:p>
+        </w:tc>
+        <w:tc>
+          <w:tcPr>
+            <w:tcW w:type="dxa" w:w="1234"/>
+          </w:tcPr>
+          <w:p>
+            <w:r>
+              <w:t>Combined_Anomaly</w:t>
+            </w:r>
+          </w:p>
+        </w:tc>
+        <w:tc>
+          <w:tcPr>
+            <w:tcW w:type="dxa" w:w="1234"/>
+          </w:tcPr>
+          <w:p>
+            <w:r>
+              <w:t>46.7%</w:t>
             </w:r>
           </w:p>
         </w:tc>
@@ -2153,57 +2153,57 @@
           </w:tcPr>
           <w:p>
             <w:r>
-              <w:t>13154</w:t>
-            </w:r>
-          </w:p>
-        </w:tc>
-        <w:tc>
-          <w:tcPr>
-            <w:tcW w:type="dxa" w:w="1234"/>
-          </w:tcPr>
-          <w:p>
-            <w:r>
-              <w:t>#7</w:t>
-            </w:r>
-          </w:p>
-        </w:tc>
-        <w:tc>
-          <w:tcPr>
-            <w:tcW w:type="dxa" w:w="1234"/>
-          </w:tcPr>
-          <w:p>
-            <w:r>
-              <w:t>Normal (64%)</w:t>
-            </w:r>
-          </w:p>
-        </w:tc>
-        <w:tc>
-          <w:tcPr>
-            <w:tcW w:type="dxa" w:w="1234"/>
-          </w:tcPr>
-          <w:p>
-            <w:r>
-              <w:t>Normal (43%)</w:t>
-            </w:r>
-          </w:p>
-        </w:tc>
-        <w:tc>
-          <w:tcPr>
-            <w:tcW w:type="dxa" w:w="1234"/>
-          </w:tcPr>
-          <w:p>
-            <w:r>
-              <w:t>Normal</w:t>
-            </w:r>
-          </w:p>
-        </w:tc>
-        <w:tc>
-          <w:tcPr>
-            <w:tcW w:type="dxa" w:w="1234"/>
-          </w:tcPr>
-          <w:p>
-            <w:r>
-              <w:t>51.6%</w:t>
+              <w:t>14431</w:t>
+            </w:r>
+          </w:p>
+        </w:tc>
+        <w:tc>
+          <w:tcPr>
+            <w:tcW w:type="dxa" w:w="1234"/>
+          </w:tcPr>
+          <w:p>
+            <w:r>
+              <w:t>#6</w:t>
+            </w:r>
+          </w:p>
+        </w:tc>
+        <w:tc>
+          <w:tcPr>
+            <w:tcW w:type="dxa" w:w="1234"/>
+          </w:tcPr>
+          <w:p>
+            <w:r>
+              <w:t>Normal (45%)</w:t>
+            </w:r>
+          </w:p>
+        </w:tc>
+        <w:tc>
+          <w:tcPr>
+            <w:tcW w:type="dxa" w:w="1234"/>
+          </w:tcPr>
+          <w:p>
+            <w:r>
+              <w:t>Combined_Anomaly (91%)</w:t>
+            </w:r>
+          </w:p>
+        </w:tc>
+        <w:tc>
+          <w:tcPr>
+            <w:tcW w:type="dxa" w:w="1234"/>
+          </w:tcPr>
+          <w:p>
+            <w:r>
+              <w:t>Combined_Anomaly</w:t>
+            </w:r>
+          </w:p>
+        </w:tc>
+        <w:tc>
+          <w:tcPr>
+            <w:tcW w:type="dxa" w:w="1234"/>
+          </w:tcPr>
+          <w:p>
+            <w:r>
+              <w:t>67.0%</w:t>
             </w:r>
           </w:p>
         </w:tc>
@@ -2225,57 +2225,57 @@
           </w:tcPr>
           <w:p>
             <w:r>
-              <w:t>13154</w:t>
-            </w:r>
-          </w:p>
-        </w:tc>
-        <w:tc>
-          <w:tcPr>
-            <w:tcW w:type="dxa" w:w="1234"/>
-          </w:tcPr>
-          <w:p>
-            <w:r>
-              <w:t>#8</w:t>
-            </w:r>
-          </w:p>
-        </w:tc>
-        <w:tc>
-          <w:tcPr>
-            <w:tcW w:type="dxa" w:w="1234"/>
-          </w:tcPr>
-          <w:p>
-            <w:r>
-              <w:t>Tail_Anomaly (85%)</w:t>
-            </w:r>
-          </w:p>
-        </w:tc>
-        <w:tc>
-          <w:tcPr>
-            <w:tcW w:type="dxa" w:w="1234"/>
-          </w:tcPr>
-          <w:p>
-            <w:r>
-              <w:t>Combined_Anomaly (55%)</w:t>
-            </w:r>
-          </w:p>
-        </w:tc>
-        <w:tc>
-          <w:tcPr>
-            <w:tcW w:type="dxa" w:w="1234"/>
-          </w:tcPr>
-          <w:p>
-            <w:r>
-              <w:t>Tail_Anomaly</w:t>
-            </w:r>
-          </w:p>
-        </w:tc>
-        <w:tc>
-          <w:tcPr>
-            <w:tcW w:type="dxa" w:w="1234"/>
-          </w:tcPr>
-          <w:p>
-            <w:r>
-              <w:t>34.9%</w:t>
+              <w:t>14431</w:t>
+            </w:r>
+          </w:p>
+        </w:tc>
+        <w:tc>
+          <w:tcPr>
+            <w:tcW w:type="dxa" w:w="1234"/>
+          </w:tcPr>
+          <w:p>
+            <w:r>
+              <w:t>#7</w:t>
+            </w:r>
+          </w:p>
+        </w:tc>
+        <w:tc>
+          <w:tcPr>
+            <w:tcW w:type="dxa" w:w="1234"/>
+          </w:tcPr>
+          <w:p>
+            <w:r>
+              <w:t>Normal (44%)</w:t>
+            </w:r>
+          </w:p>
+        </w:tc>
+        <w:tc>
+          <w:tcPr>
+            <w:tcW w:type="dxa" w:w="1234"/>
+          </w:tcPr>
+          <w:p>
+            <w:r>
+              <w:t>Combined_Anomaly (62%)</w:t>
+            </w:r>
+          </w:p>
+        </w:tc>
+        <w:tc>
+          <w:tcPr>
+            <w:tcW w:type="dxa" w:w="1234"/>
+          </w:tcPr>
+          <w:p>
+            <w:r>
+              <w:t>Combined_Anomaly</w:t>
+            </w:r>
+          </w:p>
+        </w:tc>
+        <w:tc>
+          <w:tcPr>
+            <w:tcW w:type="dxa" w:w="1234"/>
+          </w:tcPr>
+          <w:p>
+            <w:r>
+              <w:t>49.0%</w:t>
             </w:r>
           </w:p>
         </w:tc>
@@ -2297,57 +2297,57 @@
           </w:tcPr>
           <w:p>
             <w:r>
-              <w:t>13154</w:t>
-            </w:r>
-          </w:p>
-        </w:tc>
-        <w:tc>
-          <w:tcPr>
-            <w:tcW w:type="dxa" w:w="1234"/>
-          </w:tcPr>
-          <w:p>
-            <w:r>
-              <w:t>#9</w:t>
-            </w:r>
-          </w:p>
-        </w:tc>
-        <w:tc>
-          <w:tcPr>
-            <w:tcW w:type="dxa" w:w="1234"/>
-          </w:tcPr>
-          <w:p>
-            <w:r>
-              <w:t>Combined_Anomaly (73%)</w:t>
-            </w:r>
-          </w:p>
-        </w:tc>
-        <w:tc>
-          <w:tcPr>
-            <w:tcW w:type="dxa" w:w="1234"/>
-          </w:tcPr>
-          <w:p>
-            <w:r>
-              <w:t>Tail_Anomaly (95%)</w:t>
-            </w:r>
-          </w:p>
-        </w:tc>
-        <w:tc>
-          <w:tcPr>
-            <w:tcW w:type="dxa" w:w="1234"/>
-          </w:tcPr>
-          <w:p>
-            <w:r>
-              <w:t>Tail_Anomaly</w:t>
-            </w:r>
-          </w:p>
-        </w:tc>
-        <w:tc>
-          <w:tcPr>
-            <w:tcW w:type="dxa" w:w="1234"/>
-          </w:tcPr>
-          <w:p>
-            <w:r>
-              <w:t>57.6%</w:t>
+              <w:t>14431</w:t>
+            </w:r>
+          </w:p>
+        </w:tc>
+        <w:tc>
+          <w:tcPr>
+            <w:tcW w:type="dxa" w:w="1234"/>
+          </w:tcPr>
+          <w:p>
+            <w:r>
+              <w:t>#8</w:t>
+            </w:r>
+          </w:p>
+        </w:tc>
+        <w:tc>
+          <w:tcPr>
+            <w:tcW w:type="dxa" w:w="1234"/>
+          </w:tcPr>
+          <w:p>
+            <w:r>
+              <w:t>Head_Anomaly (40%)</w:t>
+            </w:r>
+          </w:p>
+        </w:tc>
+        <w:tc>
+          <w:tcPr>
+            <w:tcW w:type="dxa" w:w="1234"/>
+          </w:tcPr>
+          <w:p>
+            <w:r>
+              <w:t>Combined_Anomaly (72%)</w:t>
+            </w:r>
+          </w:p>
+        </w:tc>
+        <w:tc>
+          <w:tcPr>
+            <w:tcW w:type="dxa" w:w="1234"/>
+          </w:tcPr>
+          <w:p>
+            <w:r>
+              <w:t>Combined_Anomaly</w:t>
+            </w:r>
+          </w:p>
+        </w:tc>
+        <w:tc>
+          <w:tcPr>
+            <w:tcW w:type="dxa" w:w="1234"/>
+          </w:tcPr>
+          <w:p>
+            <w:r>
+              <w:t>51.1%</w:t>
             </w:r>
           </w:p>
         </w:tc>
@@ -2369,57 +2369,57 @@
           </w:tcPr>
           <w:p>
             <w:r>
-              <w:t>13154</w:t>
-            </w:r>
-          </w:p>
-        </w:tc>
-        <w:tc>
-          <w:tcPr>
-            <w:tcW w:type="dxa" w:w="1234"/>
-          </w:tcPr>
-          <w:p>
-            <w:r>
-              <w:t>#10</w:t>
-            </w:r>
-          </w:p>
-        </w:tc>
-        <w:tc>
-          <w:tcPr>
-            <w:tcW w:type="dxa" w:w="1234"/>
-          </w:tcPr>
-          <w:p>
-            <w:r>
-              <w:t>Head_Anomaly (71%)</w:t>
-            </w:r>
-          </w:p>
-        </w:tc>
-        <w:tc>
-          <w:tcPr>
-            <w:tcW w:type="dxa" w:w="1234"/>
-          </w:tcPr>
-          <w:p>
-            <w:r>
-              <w:t>Tail_Anomaly (61%)</w:t>
-            </w:r>
-          </w:p>
-        </w:tc>
-        <w:tc>
-          <w:tcPr>
-            <w:tcW w:type="dxa" w:w="1234"/>
-          </w:tcPr>
-          <w:p>
-            <w:r>
-              <w:t>Tail_Anomaly</w:t>
-            </w:r>
-          </w:p>
-        </w:tc>
-        <w:tc>
-          <w:tcPr>
-            <w:tcW w:type="dxa" w:w="1234"/>
-          </w:tcPr>
-          <w:p>
-            <w:r>
-              <w:t>36.7%</w:t>
+              <w:t>14431</w:t>
+            </w:r>
+          </w:p>
+        </w:tc>
+        <w:tc>
+          <w:tcPr>
+            <w:tcW w:type="dxa" w:w="1234"/>
+          </w:tcPr>
+          <w:p>
+            <w:r>
+              <w:t>#9</w:t>
+            </w:r>
+          </w:p>
+        </w:tc>
+        <w:tc>
+          <w:tcPr>
+            <w:tcW w:type="dxa" w:w="1234"/>
+          </w:tcPr>
+          <w:p>
+            <w:r>
+              <w:t>Normal (42%)</w:t>
+            </w:r>
+          </w:p>
+        </w:tc>
+        <w:tc>
+          <w:tcPr>
+            <w:tcW w:type="dxa" w:w="1234"/>
+          </w:tcPr>
+          <w:p>
+            <w:r>
+              <w:t>Head_Anomaly (48%)</w:t>
+            </w:r>
+          </w:p>
+        </w:tc>
+        <w:tc>
+          <w:tcPr>
+            <w:tcW w:type="dxa" w:w="1234"/>
+          </w:tcPr>
+          <w:p>
+            <w:r>
+              <w:t>Head_Anomaly</w:t>
+            </w:r>
+          </w:p>
+        </w:tc>
+        <w:tc>
+          <w:tcPr>
+            <w:tcW w:type="dxa" w:w="1234"/>
+          </w:tcPr>
+          <w:p>
+            <w:r>
+              <w:t>44.4%</w:t>
             </w:r>
           </w:p>
         </w:tc>
@@ -2441,57 +2441,57 @@
           </w:tcPr>
           <w:p>
             <w:r>
-              <w:t>13154</w:t>
-            </w:r>
-          </w:p>
-        </w:tc>
-        <w:tc>
-          <w:tcPr>
-            <w:tcW w:type="dxa" w:w="1234"/>
-          </w:tcPr>
-          <w:p>
-            <w:r>
-              <w:t>#11</w:t>
-            </w:r>
-          </w:p>
-        </w:tc>
-        <w:tc>
-          <w:tcPr>
-            <w:tcW w:type="dxa" w:w="1234"/>
-          </w:tcPr>
-          <w:p>
-            <w:r>
-              <w:t>Normal (73%)</w:t>
-            </w:r>
-          </w:p>
-        </w:tc>
-        <w:tc>
-          <w:tcPr>
-            <w:tcW w:type="dxa" w:w="1234"/>
-          </w:tcPr>
-          <w:p>
-            <w:r>
-              <w:t>Head_Anomaly (59%)</w:t>
-            </w:r>
-          </w:p>
-        </w:tc>
-        <w:tc>
-          <w:tcPr>
-            <w:tcW w:type="dxa" w:w="1234"/>
-          </w:tcPr>
-          <w:p>
-            <w:r>
-              <w:t>Head_Anomaly</w:t>
-            </w:r>
-          </w:p>
-        </w:tc>
-        <w:tc>
-          <w:tcPr>
-            <w:tcW w:type="dxa" w:w="1234"/>
-          </w:tcPr>
-          <w:p>
-            <w:r>
-              <w:t>35.4%</w:t>
+              <w:t>14431</w:t>
+            </w:r>
+          </w:p>
+        </w:tc>
+        <w:tc>
+          <w:tcPr>
+            <w:tcW w:type="dxa" w:w="1234"/>
+          </w:tcPr>
+          <w:p>
+            <w:r>
+              <w:t>#10</w:t>
+            </w:r>
+          </w:p>
+        </w:tc>
+        <w:tc>
+          <w:tcPr>
+            <w:tcW w:type="dxa" w:w="1234"/>
+          </w:tcPr>
+          <w:p>
+            <w:r>
+              <w:t>Normal (52%)</w:t>
+            </w:r>
+          </w:p>
+        </w:tc>
+        <w:tc>
+          <w:tcPr>
+            <w:tcW w:type="dxa" w:w="1234"/>
+          </w:tcPr>
+          <w:p>
+            <w:r>
+              <w:t>Combined_Anomaly (85%)</w:t>
+            </w:r>
+          </w:p>
+        </w:tc>
+        <w:tc>
+          <w:tcPr>
+            <w:tcW w:type="dxa" w:w="1234"/>
+          </w:tcPr>
+          <w:p>
+            <w:r>
+              <w:t>Combined_Anomaly</w:t>
+            </w:r>
+          </w:p>
+        </w:tc>
+        <w:tc>
+          <w:tcPr>
+            <w:tcW w:type="dxa" w:w="1234"/>
+          </w:tcPr>
+          <w:p>
+            <w:r>
+              <w:t>57.8%</w:t>
             </w:r>
           </w:p>
         </w:tc>
@@ -2513,57 +2513,57 @@
           </w:tcPr>
           <w:p>
             <w:r>
-              <w:t>13154</w:t>
-            </w:r>
-          </w:p>
-        </w:tc>
-        <w:tc>
-          <w:tcPr>
-            <w:tcW w:type="dxa" w:w="1234"/>
-          </w:tcPr>
-          <w:p>
-            <w:r>
-              <w:t>#12</w:t>
-            </w:r>
-          </w:p>
-        </w:tc>
-        <w:tc>
-          <w:tcPr>
-            <w:tcW w:type="dxa" w:w="1234"/>
-          </w:tcPr>
-          <w:p>
-            <w:r>
-              <w:t>Normal (99%)</w:t>
-            </w:r>
-          </w:p>
-        </w:tc>
-        <w:tc>
-          <w:tcPr>
-            <w:tcW w:type="dxa" w:w="1234"/>
-          </w:tcPr>
-          <w:p>
-            <w:r>
-              <w:t>Head_Anomaly (53%)</w:t>
-            </w:r>
-          </w:p>
-        </w:tc>
-        <w:tc>
-          <w:tcPr>
-            <w:tcW w:type="dxa" w:w="1234"/>
-          </w:tcPr>
-          <w:p>
-            <w:r>
-              <w:t>Normal</w:t>
-            </w:r>
-          </w:p>
-        </w:tc>
-        <w:tc>
-          <w:tcPr>
-            <w:tcW w:type="dxa" w:w="1234"/>
-          </w:tcPr>
-          <w:p>
-            <w:r>
-              <w:t>50.5%</w:t>
+              <w:t>14431</w:t>
+            </w:r>
+          </w:p>
+        </w:tc>
+        <w:tc>
+          <w:tcPr>
+            <w:tcW w:type="dxa" w:w="1234"/>
+          </w:tcPr>
+          <w:p>
+            <w:r>
+              <w:t>#11</w:t>
+            </w:r>
+          </w:p>
+        </w:tc>
+        <w:tc>
+          <w:tcPr>
+            <w:tcW w:type="dxa" w:w="1234"/>
+          </w:tcPr>
+          <w:p>
+            <w:r>
+              <w:t>Normal (86%)</w:t>
+            </w:r>
+          </w:p>
+        </w:tc>
+        <w:tc>
+          <w:tcPr>
+            <w:tcW w:type="dxa" w:w="1234"/>
+          </w:tcPr>
+          <w:p>
+            <w:r>
+              <w:t>Combined_Anomaly (75%)</w:t>
+            </w:r>
+          </w:p>
+        </w:tc>
+        <w:tc>
+          <w:tcPr>
+            <w:tcW w:type="dxa" w:w="1234"/>
+          </w:tcPr>
+          <w:p>
+            <w:r>
+              <w:t>Combined_Anomaly</w:t>
+            </w:r>
+          </w:p>
+        </w:tc>
+        <w:tc>
+          <w:tcPr>
+            <w:tcW w:type="dxa" w:w="1234"/>
+          </w:tcPr>
+          <w:p>
+            <w:r>
+              <w:t>48.7%</w:t>
             </w:r>
           </w:p>
         </w:tc>
@@ -2585,37 +2585,37 @@
           </w:tcPr>
           <w:p>
             <w:r>
-              <w:t>13154</w:t>
-            </w:r>
-          </w:p>
-        </w:tc>
-        <w:tc>
-          <w:tcPr>
-            <w:tcW w:type="dxa" w:w="1234"/>
-          </w:tcPr>
-          <w:p>
-            <w:r>
-              <w:t>#13</w:t>
-            </w:r>
-          </w:p>
-        </w:tc>
-        <w:tc>
-          <w:tcPr>
-            <w:tcW w:type="dxa" w:w="1234"/>
-          </w:tcPr>
-          <w:p>
-            <w:r>
-              <w:t>Combined_Anomaly (98%)</w:t>
-            </w:r>
-          </w:p>
-        </w:tc>
-        <w:tc>
-          <w:tcPr>
-            <w:tcW w:type="dxa" w:w="1234"/>
-          </w:tcPr>
-          <w:p>
-            <w:r>
-              <w:t>Tail_Anomaly (58%)</w:t>
+              <w:t>14431</w:t>
+            </w:r>
+          </w:p>
+        </w:tc>
+        <w:tc>
+          <w:tcPr>
+            <w:tcW w:type="dxa" w:w="1234"/>
+          </w:tcPr>
+          <w:p>
+            <w:r>
+              <w:t>#12</w:t>
+            </w:r>
+          </w:p>
+        </w:tc>
+        <w:tc>
+          <w:tcPr>
+            <w:tcW w:type="dxa" w:w="1234"/>
+          </w:tcPr>
+          <w:p>
+            <w:r>
+              <w:t>Normal (39%)</w:t>
+            </w:r>
+          </w:p>
+        </w:tc>
+        <w:tc>
+          <w:tcPr>
+            <w:tcW w:type="dxa" w:w="1234"/>
+          </w:tcPr>
+          <w:p>
+            <w:r>
+              <w:t>Combined_Anomaly (71%)</w:t>
             </w:r>
           </w:p>
         </w:tc>
@@ -2635,7 +2635,7 @@
           </w:tcPr>
           <w:p>
             <w:r>
-              <w:t>60.5%</w:t>
+              <w:t>52.8%</w:t>
             </w:r>
           </w:p>
         </w:tc>
@@ -2657,57 +2657,57 @@
           </w:tcPr>
           <w:p>
             <w:r>
-              <w:t>13154</w:t>
-            </w:r>
-          </w:p>
-        </w:tc>
-        <w:tc>
-          <w:tcPr>
-            <w:tcW w:type="dxa" w:w="1234"/>
-          </w:tcPr>
-          <w:p>
-            <w:r>
-              <w:t>#14</w:t>
-            </w:r>
-          </w:p>
-        </w:tc>
-        <w:tc>
-          <w:tcPr>
-            <w:tcW w:type="dxa" w:w="1234"/>
-          </w:tcPr>
-          <w:p>
-            <w:r>
-              <w:t>Combined_Anomaly (100%)</w:t>
-            </w:r>
-          </w:p>
-        </w:tc>
-        <w:tc>
-          <w:tcPr>
-            <w:tcW w:type="dxa" w:w="1234"/>
-          </w:tcPr>
-          <w:p>
-            <w:r>
-              <w:t>Tail_Anomaly (96%)</w:t>
-            </w:r>
-          </w:p>
-        </w:tc>
-        <w:tc>
-          <w:tcPr>
-            <w:tcW w:type="dxa" w:w="1234"/>
-          </w:tcPr>
-          <w:p>
-            <w:r>
-              <w:t>Tail_Anomaly</w:t>
-            </w:r>
-          </w:p>
-        </w:tc>
-        <w:tc>
-          <w:tcPr>
-            <w:tcW w:type="dxa" w:w="1234"/>
-          </w:tcPr>
-          <w:p>
-            <w:r>
-              <w:t>57.5%</w:t>
+              <w:t>14431</w:t>
+            </w:r>
+          </w:p>
+        </w:tc>
+        <w:tc>
+          <w:tcPr>
+            <w:tcW w:type="dxa" w:w="1234"/>
+          </w:tcPr>
+          <w:p>
+            <w:r>
+              <w:t>#13</w:t>
+            </w:r>
+          </w:p>
+        </w:tc>
+        <w:tc>
+          <w:tcPr>
+            <w:tcW w:type="dxa" w:w="1234"/>
+          </w:tcPr>
+          <w:p>
+            <w:r>
+              <w:t>Head_Anomaly (34%)</w:t>
+            </w:r>
+          </w:p>
+        </w:tc>
+        <w:tc>
+          <w:tcPr>
+            <w:tcW w:type="dxa" w:w="1234"/>
+          </w:tcPr>
+          <w:p>
+            <w:r>
+              <w:t>Combined_Anomaly (84%)</w:t>
+            </w:r>
+          </w:p>
+        </w:tc>
+        <w:tc>
+          <w:tcPr>
+            <w:tcW w:type="dxa" w:w="1234"/>
+          </w:tcPr>
+          <w:p>
+            <w:r>
+              <w:t>Combined_Anomaly</w:t>
+            </w:r>
+          </w:p>
+        </w:tc>
+        <w:tc>
+          <w:tcPr>
+            <w:tcW w:type="dxa" w:w="1234"/>
+          </w:tcPr>
+          <w:p>
+            <w:r>
+              <w:t>58.8%</w:t>
             </w:r>
           </w:p>
         </w:tc>
@@ -2729,7 +2729,79 @@
           </w:tcPr>
           <w:p>
             <w:r>
-              <w:t>13154</w:t>
+              <w:t>14431</w:t>
+            </w:r>
+          </w:p>
+        </w:tc>
+        <w:tc>
+          <w:tcPr>
+            <w:tcW w:type="dxa" w:w="1234"/>
+          </w:tcPr>
+          <w:p>
+            <w:r>
+              <w:t>#14</w:t>
+            </w:r>
+          </w:p>
+        </w:tc>
+        <w:tc>
+          <w:tcPr>
+            <w:tcW w:type="dxa" w:w="1234"/>
+          </w:tcPr>
+          <w:p>
+            <w:r>
+              <w:t>Head_Anomaly (43%)</w:t>
+            </w:r>
+          </w:p>
+        </w:tc>
+        <w:tc>
+          <w:tcPr>
+            <w:tcW w:type="dxa" w:w="1234"/>
+          </w:tcPr>
+          <w:p>
+            <w:r>
+              <w:t>Combined_Anomaly (83%)</w:t>
+            </w:r>
+          </w:p>
+        </w:tc>
+        <w:tc>
+          <w:tcPr>
+            <w:tcW w:type="dxa" w:w="1234"/>
+          </w:tcPr>
+          <w:p>
+            <w:r>
+              <w:t>Combined_Anomaly</w:t>
+            </w:r>
+          </w:p>
+        </w:tc>
+        <w:tc>
+          <w:tcPr>
+            <w:tcW w:type="dxa" w:w="1234"/>
+          </w:tcPr>
+          <w:p>
+            <w:r>
+              <w:t>59.4%</w:t>
+            </w:r>
+          </w:p>
+        </w:tc>
+      </w:tr>
+      <w:tr>
+        <w:tc>
+          <w:tcPr>
+            <w:tcW w:type="dxa" w:w="1234"/>
+          </w:tcPr>
+          <w:p>
+            <w:r>
+              <w:t>32</w:t>
+            </w:r>
+          </w:p>
+        </w:tc>
+        <w:tc>
+          <w:tcPr>
+            <w:tcW w:type="dxa" w:w="1234"/>
+          </w:tcPr>
+          <w:p>
+            <w:r>
+              <w:t>14431</w:t>
             </w:r>
           </w:p>
         </w:tc>
@@ -2749,37 +2821,613 @@
           </w:tcPr>
           <w:p>
             <w:r>
-              <w:t>Combined_Anomaly (74%)</w:t>
-            </w:r>
-          </w:p>
-        </w:tc>
-        <w:tc>
-          <w:tcPr>
-            <w:tcW w:type="dxa" w:w="1234"/>
-          </w:tcPr>
-          <w:p>
-            <w:r>
-              <w:t>Tail_Anomaly (77%)</w:t>
-            </w:r>
-          </w:p>
-        </w:tc>
-        <w:tc>
-          <w:tcPr>
-            <w:tcW w:type="dxa" w:w="1234"/>
-          </w:tcPr>
-          <w:p>
-            <w:r>
-              <w:t>Tail_Anomaly</w:t>
-            </w:r>
-          </w:p>
-        </w:tc>
-        <w:tc>
-          <w:tcPr>
-            <w:tcW w:type="dxa" w:w="1234"/>
-          </w:tcPr>
-          <w:p>
-            <w:r>
-              <w:t>46.7%</w:t>
+              <w:t>Normal (56%)</w:t>
+            </w:r>
+          </w:p>
+        </w:tc>
+        <w:tc>
+          <w:tcPr>
+            <w:tcW w:type="dxa" w:w="1234"/>
+          </w:tcPr>
+          <w:p>
+            <w:r>
+              <w:t>Normal (66%)</w:t>
+            </w:r>
+          </w:p>
+        </w:tc>
+        <w:tc>
+          <w:tcPr>
+            <w:tcW w:type="dxa" w:w="1234"/>
+          </w:tcPr>
+          <w:p>
+            <w:r>
+              <w:t>Normal</w:t>
+            </w:r>
+          </w:p>
+        </w:tc>
+        <w:tc>
+          <w:tcPr>
+            <w:tcW w:type="dxa" w:w="1234"/>
+          </w:tcPr>
+          <w:p>
+            <w:r>
+              <w:t>62.1%</w:t>
+            </w:r>
+          </w:p>
+        </w:tc>
+      </w:tr>
+      <w:tr>
+        <w:tc>
+          <w:tcPr>
+            <w:tcW w:type="dxa" w:w="1234"/>
+          </w:tcPr>
+          <w:p>
+            <w:r>
+              <w:t>33</w:t>
+            </w:r>
+          </w:p>
+        </w:tc>
+        <w:tc>
+          <w:tcPr>
+            <w:tcW w:type="dxa" w:w="1234"/>
+          </w:tcPr>
+          <w:p>
+            <w:r>
+              <w:t>14431</w:t>
+            </w:r>
+          </w:p>
+        </w:tc>
+        <w:tc>
+          <w:tcPr>
+            <w:tcW w:type="dxa" w:w="1234"/>
+          </w:tcPr>
+          <w:p>
+            <w:r>
+              <w:t>#16</w:t>
+            </w:r>
+          </w:p>
+        </w:tc>
+        <w:tc>
+          <w:tcPr>
+            <w:tcW w:type="dxa" w:w="1234"/>
+          </w:tcPr>
+          <w:p>
+            <w:r>
+              <w:t>Normal (75%)</w:t>
+            </w:r>
+          </w:p>
+        </w:tc>
+        <w:tc>
+          <w:tcPr>
+            <w:tcW w:type="dxa" w:w="1234"/>
+          </w:tcPr>
+          <w:p>
+            <w:r>
+              <w:t>Normal (36%)</w:t>
+            </w:r>
+          </w:p>
+        </w:tc>
+        <w:tc>
+          <w:tcPr>
+            <w:tcW w:type="dxa" w:w="1234"/>
+          </w:tcPr>
+          <w:p>
+            <w:r>
+              <w:t>Normal</w:t>
+            </w:r>
+          </w:p>
+        </w:tc>
+        <w:tc>
+          <w:tcPr>
+            <w:tcW w:type="dxa" w:w="1234"/>
+          </w:tcPr>
+          <w:p>
+            <w:r>
+              <w:t>51.7%</w:t>
+            </w:r>
+          </w:p>
+        </w:tc>
+      </w:tr>
+      <w:tr>
+        <w:tc>
+          <w:tcPr>
+            <w:tcW w:type="dxa" w:w="1234"/>
+          </w:tcPr>
+          <w:p>
+            <w:r>
+              <w:t>34</w:t>
+            </w:r>
+          </w:p>
+        </w:tc>
+        <w:tc>
+          <w:tcPr>
+            <w:tcW w:type="dxa" w:w="1234"/>
+          </w:tcPr>
+          <w:p>
+            <w:r>
+              <w:t>14431</w:t>
+            </w:r>
+          </w:p>
+        </w:tc>
+        <w:tc>
+          <w:tcPr>
+            <w:tcW w:type="dxa" w:w="1234"/>
+          </w:tcPr>
+          <w:p>
+            <w:r>
+              <w:t>#17</w:t>
+            </w:r>
+          </w:p>
+        </w:tc>
+        <w:tc>
+          <w:tcPr>
+            <w:tcW w:type="dxa" w:w="1234"/>
+          </w:tcPr>
+          <w:p>
+            <w:r>
+              <w:t>Normal (92%)</w:t>
+            </w:r>
+          </w:p>
+        </w:tc>
+        <w:tc>
+          <w:tcPr>
+            <w:tcW w:type="dxa" w:w="1234"/>
+          </w:tcPr>
+          <w:p>
+            <w:r>
+              <w:t>Combined_Anomaly (96%)</w:t>
+            </w:r>
+          </w:p>
+        </w:tc>
+        <w:tc>
+          <w:tcPr>
+            <w:tcW w:type="dxa" w:w="1234"/>
+          </w:tcPr>
+          <w:p>
+            <w:r>
+              <w:t>Combined_Anomaly</w:t>
+            </w:r>
+          </w:p>
+        </w:tc>
+        <w:tc>
+          <w:tcPr>
+            <w:tcW w:type="dxa" w:w="1234"/>
+          </w:tcPr>
+          <w:p>
+            <w:r>
+              <w:t>60.0%</w:t>
+            </w:r>
+          </w:p>
+        </w:tc>
+      </w:tr>
+      <w:tr>
+        <w:tc>
+          <w:tcPr>
+            <w:tcW w:type="dxa" w:w="1234"/>
+          </w:tcPr>
+          <w:p>
+            <w:r>
+              <w:t>35</w:t>
+            </w:r>
+          </w:p>
+        </w:tc>
+        <w:tc>
+          <w:tcPr>
+            <w:tcW w:type="dxa" w:w="1234"/>
+          </w:tcPr>
+          <w:p>
+            <w:r>
+              <w:t>14431</w:t>
+            </w:r>
+          </w:p>
+        </w:tc>
+        <w:tc>
+          <w:tcPr>
+            <w:tcW w:type="dxa" w:w="1234"/>
+          </w:tcPr>
+          <w:p>
+            <w:r>
+              <w:t>#18</w:t>
+            </w:r>
+          </w:p>
+        </w:tc>
+        <w:tc>
+          <w:tcPr>
+            <w:tcW w:type="dxa" w:w="1234"/>
+          </w:tcPr>
+          <w:p>
+            <w:r>
+              <w:t>Normal (58%)</w:t>
+            </w:r>
+          </w:p>
+        </w:tc>
+        <w:tc>
+          <w:tcPr>
+            <w:tcW w:type="dxa" w:w="1234"/>
+          </w:tcPr>
+          <w:p>
+            <w:r>
+              <w:t>Normal (71%)</w:t>
+            </w:r>
+          </w:p>
+        </w:tc>
+        <w:tc>
+          <w:tcPr>
+            <w:tcW w:type="dxa" w:w="1234"/>
+          </w:tcPr>
+          <w:p>
+            <w:r>
+              <w:t>Normal</w:t>
+            </w:r>
+          </w:p>
+        </w:tc>
+        <w:tc>
+          <w:tcPr>
+            <w:tcW w:type="dxa" w:w="1234"/>
+          </w:tcPr>
+          <w:p>
+            <w:r>
+              <w:t>65.5%</w:t>
+            </w:r>
+          </w:p>
+        </w:tc>
+      </w:tr>
+      <w:tr>
+        <w:tc>
+          <w:tcPr>
+            <w:tcW w:type="dxa" w:w="1234"/>
+          </w:tcPr>
+          <w:p>
+            <w:r>
+              <w:t>36</w:t>
+            </w:r>
+          </w:p>
+        </w:tc>
+        <w:tc>
+          <w:tcPr>
+            <w:tcW w:type="dxa" w:w="1234"/>
+          </w:tcPr>
+          <w:p>
+            <w:r>
+              <w:t>14431</w:t>
+            </w:r>
+          </w:p>
+        </w:tc>
+        <w:tc>
+          <w:tcPr>
+            <w:tcW w:type="dxa" w:w="1234"/>
+          </w:tcPr>
+          <w:p>
+            <w:r>
+              <w:t>#19</w:t>
+            </w:r>
+          </w:p>
+        </w:tc>
+        <w:tc>
+          <w:tcPr>
+            <w:tcW w:type="dxa" w:w="1234"/>
+          </w:tcPr>
+          <w:p>
+            <w:r>
+              <w:t>Normal (56%)</w:t>
+            </w:r>
+          </w:p>
+        </w:tc>
+        <w:tc>
+          <w:tcPr>
+            <w:tcW w:type="dxa" w:w="1234"/>
+          </w:tcPr>
+          <w:p>
+            <w:r>
+              <w:t>Head_Anomaly (45%)</w:t>
+            </w:r>
+          </w:p>
+        </w:tc>
+        <w:tc>
+          <w:tcPr>
+            <w:tcW w:type="dxa" w:w="1234"/>
+          </w:tcPr>
+          <w:p>
+            <w:r>
+              <w:t>Head_Anomaly</w:t>
+            </w:r>
+          </w:p>
+        </w:tc>
+        <w:tc>
+          <w:tcPr>
+            <w:tcW w:type="dxa" w:w="1234"/>
+          </w:tcPr>
+          <w:p>
+            <w:r>
+              <w:t>38.6%</w:t>
+            </w:r>
+          </w:p>
+        </w:tc>
+      </w:tr>
+      <w:tr>
+        <w:tc>
+          <w:tcPr>
+            <w:tcW w:type="dxa" w:w="1234"/>
+          </w:tcPr>
+          <w:p>
+            <w:r>
+              <w:t>37</w:t>
+            </w:r>
+          </w:p>
+        </w:tc>
+        <w:tc>
+          <w:tcPr>
+            <w:tcW w:type="dxa" w:w="1234"/>
+          </w:tcPr>
+          <w:p>
+            <w:r>
+              <w:t>14431</w:t>
+            </w:r>
+          </w:p>
+        </w:tc>
+        <w:tc>
+          <w:tcPr>
+            <w:tcW w:type="dxa" w:w="1234"/>
+          </w:tcPr>
+          <w:p>
+            <w:r>
+              <w:t>#20</w:t>
+            </w:r>
+          </w:p>
+        </w:tc>
+        <w:tc>
+          <w:tcPr>
+            <w:tcW w:type="dxa" w:w="1234"/>
+          </w:tcPr>
+          <w:p>
+            <w:r>
+              <w:t>Normal (34%)</w:t>
+            </w:r>
+          </w:p>
+        </w:tc>
+        <w:tc>
+          <w:tcPr>
+            <w:tcW w:type="dxa" w:w="1234"/>
+          </w:tcPr>
+          <w:p>
+            <w:r>
+              <w:t>Normal (90%)</w:t>
+            </w:r>
+          </w:p>
+        </w:tc>
+        <w:tc>
+          <w:tcPr>
+            <w:tcW w:type="dxa" w:w="1234"/>
+          </w:tcPr>
+          <w:p>
+            <w:r>
+              <w:t>Normal</w:t>
+            </w:r>
+          </w:p>
+        </w:tc>
+        <w:tc>
+          <w:tcPr>
+            <w:tcW w:type="dxa" w:w="1234"/>
+          </w:tcPr>
+          <w:p>
+            <w:r>
+              <w:t>67.5%</w:t>
+            </w:r>
+          </w:p>
+        </w:tc>
+      </w:tr>
+      <w:tr>
+        <w:tc>
+          <w:tcPr>
+            <w:tcW w:type="dxa" w:w="1234"/>
+          </w:tcPr>
+          <w:p>
+            <w:r>
+              <w:t>38</w:t>
+            </w:r>
+          </w:p>
+        </w:tc>
+        <w:tc>
+          <w:tcPr>
+            <w:tcW w:type="dxa" w:w="1234"/>
+          </w:tcPr>
+          <w:p>
+            <w:r>
+              <w:t>14431</w:t>
+            </w:r>
+          </w:p>
+        </w:tc>
+        <w:tc>
+          <w:tcPr>
+            <w:tcW w:type="dxa" w:w="1234"/>
+          </w:tcPr>
+          <w:p>
+            <w:r>
+              <w:t>#21</w:t>
+            </w:r>
+          </w:p>
+        </w:tc>
+        <w:tc>
+          <w:tcPr>
+            <w:tcW w:type="dxa" w:w="1234"/>
+          </w:tcPr>
+          <w:p>
+            <w:r>
+              <w:t>Normal (71%)</w:t>
+            </w:r>
+          </w:p>
+        </w:tc>
+        <w:tc>
+          <w:tcPr>
+            <w:tcW w:type="dxa" w:w="1234"/>
+          </w:tcPr>
+          <w:p>
+            <w:r>
+              <w:t>Head_Anomaly (95%)</w:t>
+            </w:r>
+          </w:p>
+        </w:tc>
+        <w:tc>
+          <w:tcPr>
+            <w:tcW w:type="dxa" w:w="1234"/>
+          </w:tcPr>
+          <w:p>
+            <w:r>
+              <w:t>Head_Anomaly</w:t>
+            </w:r>
+          </w:p>
+        </w:tc>
+        <w:tc>
+          <w:tcPr>
+            <w:tcW w:type="dxa" w:w="1234"/>
+          </w:tcPr>
+          <w:p>
+            <w:r>
+              <w:t>58.3%</w:t>
+            </w:r>
+          </w:p>
+        </w:tc>
+      </w:tr>
+      <w:tr>
+        <w:tc>
+          <w:tcPr>
+            <w:tcW w:type="dxa" w:w="1234"/>
+          </w:tcPr>
+          <w:p>
+            <w:r>
+              <w:t>39</w:t>
+            </w:r>
+          </w:p>
+        </w:tc>
+        <w:tc>
+          <w:tcPr>
+            <w:tcW w:type="dxa" w:w="1234"/>
+          </w:tcPr>
+          <w:p>
+            <w:r>
+              <w:t>14431</w:t>
+            </w:r>
+          </w:p>
+        </w:tc>
+        <w:tc>
+          <w:tcPr>
+            <w:tcW w:type="dxa" w:w="1234"/>
+          </w:tcPr>
+          <w:p>
+            <w:r>
+              <w:t>#22</w:t>
+            </w:r>
+          </w:p>
+        </w:tc>
+        <w:tc>
+          <w:tcPr>
+            <w:tcW w:type="dxa" w:w="1234"/>
+          </w:tcPr>
+          <w:p>
+            <w:r>
+              <w:t>Tail_Anomaly (48%)</w:t>
+            </w:r>
+          </w:p>
+        </w:tc>
+        <w:tc>
+          <w:tcPr>
+            <w:tcW w:type="dxa" w:w="1234"/>
+          </w:tcPr>
+          <w:p>
+            <w:r>
+              <w:t>Combined_Anomaly (92%)</w:t>
+            </w:r>
+          </w:p>
+        </w:tc>
+        <w:tc>
+          <w:tcPr>
+            <w:tcW w:type="dxa" w:w="1234"/>
+          </w:tcPr>
+          <w:p>
+            <w:r>
+              <w:t>Combined_Anomaly</w:t>
+            </w:r>
+          </w:p>
+        </w:tc>
+        <w:tc>
+          <w:tcPr>
+            <w:tcW w:type="dxa" w:w="1234"/>
+          </w:tcPr>
+          <w:p>
+            <w:r>
+              <w:t>61.6%</w:t>
+            </w:r>
+          </w:p>
+        </w:tc>
+      </w:tr>
+      <w:tr>
+        <w:tc>
+          <w:tcPr>
+            <w:tcW w:type="dxa" w:w="1234"/>
+          </w:tcPr>
+          <w:p>
+            <w:r>
+              <w:t>40</w:t>
+            </w:r>
+          </w:p>
+        </w:tc>
+        <w:tc>
+          <w:tcPr>
+            <w:tcW w:type="dxa" w:w="1234"/>
+          </w:tcPr>
+          <w:p>
+            <w:r>
+              <w:t>14431</w:t>
+            </w:r>
+          </w:p>
+        </w:tc>
+        <w:tc>
+          <w:tcPr>
+            <w:tcW w:type="dxa" w:w="1234"/>
+          </w:tcPr>
+          <w:p>
+            <w:r>
+              <w:t>#23</w:t>
+            </w:r>
+          </w:p>
+        </w:tc>
+        <w:tc>
+          <w:tcPr>
+            <w:tcW w:type="dxa" w:w="1234"/>
+          </w:tcPr>
+          <w:p>
+            <w:r>
+              <w:t>Combined_Anomaly (68%)</w:t>
+            </w:r>
+          </w:p>
+        </w:tc>
+        <w:tc>
+          <w:tcPr>
+            <w:tcW w:type="dxa" w:w="1234"/>
+          </w:tcPr>
+          <w:p>
+            <w:r>
+              <w:t>Combined_Anomaly (84%)</w:t>
+            </w:r>
+          </w:p>
+        </w:tc>
+        <w:tc>
+          <w:tcPr>
+            <w:tcW w:type="dxa" w:w="1234"/>
+          </w:tcPr>
+          <w:p>
+            <w:r>
+              <w:t>Combined_Anomaly</w:t>
+            </w:r>
+          </w:p>
+        </w:tc>
+        <w:tc>
+          <w:tcPr>
+            <w:tcW w:type="dxa" w:w="1234"/>
+          </w:tcPr>
+          <w:p>
+            <w:r>
+              <w:t>77.4%</w:t>
             </w:r>
           </w:p>
         </w:tc>
@@ -2803,15 +3451,15 @@
         <w:rPr>
           <w:b/>
         </w:rPr>
-        <w:t>1. Frame 11436, Sperm #3</w:t>
+        <w:t>1. Frame 3813, Sperm #1</w:t>
       </w:r>
       <w:r>
         <w:br/>
-        <w:t xml:space="preserve">   YOLOv8: Normal (92.0%)</w:t>
+        <w:t xml:space="preserve">   YOLOv8: Tail_Anomaly (84.3%)</w:t>
       </w:r>
       <w:r>
         <w:br/>
-        <w:t xml:space="preserve">   EfficientNet: Combined_Anomaly (42.8%)</w:t>
+        <w:t xml:space="preserve">   EfficientNet: Head_Anomaly (60.1%)</w:t>
       </w:r>
       <w:r>
         <w:rPr>
@@ -2821,7 +3469,7 @@
         <w:t xml:space="preserve">   → Ensemble chose: </w:t>
       </w:r>
       <w:r>
-        <w:t>Normal (43.9%)</w:t>
+        <w:t>Head_Anomaly (36.6%)</w:t>
       </w:r>
     </w:p>
     <w:p>
@@ -2829,15 +3477,15 @@
         <w:rPr>
           <w:b/>
         </w:rPr>
-        <w:t>2. Frame 11436, Sperm #4</w:t>
+        <w:t>2. Frame 3813, Sperm #4</w:t>
       </w:r>
       <w:r>
         <w:br/>
-        <w:t xml:space="preserve">   YOLOv8: Head_Anomaly (92.8%)</w:t>
+        <w:t xml:space="preserve">   YOLOv8: Tail_Anomaly (75.9%)</w:t>
       </w:r>
       <w:r>
         <w:br/>
-        <w:t xml:space="preserve">   EfficientNet: Combined_Anomaly (45.6%)</w:t>
+        <w:t xml:space="preserve">   EfficientNet: Head_Anomaly (52.4%)</w:t>
       </w:r>
       <w:r>
         <w:rPr>
@@ -2847,7 +3495,7 @@
         <w:t xml:space="preserve">   → Ensemble chose: </w:t>
       </w:r>
       <w:r>
-        <w:t>Head_Anomaly (53.7%)</w:t>
+        <w:t>Head_Anomaly (32.1%)</w:t>
       </w:r>
     </w:p>
     <w:p>
@@ -2855,15 +3503,15 @@
         <w:rPr>
           <w:b/>
         </w:rPr>
-        <w:t>3. Frame 11436, Sperm #5</w:t>
+        <w:t>3. Frame 3813, Sperm #5</w:t>
       </w:r>
       <w:r>
         <w:br/>
-        <w:t xml:space="preserve">   YOLOv8: Combined_Anomaly (56.1%)</w:t>
+        <w:t xml:space="preserve">   YOLOv8: Normal (45.5%)</w:t>
       </w:r>
       <w:r>
         <w:br/>
-        <w:t xml:space="preserve">   EfficientNet: Midpiece_Anomaly (92.2%)</w:t>
+        <w:t xml:space="preserve">   EfficientNet: Combined_Anomaly (98.1%)</w:t>
       </w:r>
       <w:r>
         <w:rPr>
@@ -2873,7 +3521,7 @@
         <w:t xml:space="preserve">   → Ensemble chose: </w:t>
       </w:r>
       <w:r>
-        <w:t>Midpiece_Anomaly (55.3%)</w:t>
+        <w:t>Combined_Anomaly (66.3%)</w:t>
       </w:r>
     </w:p>
     <w:p>
@@ -2881,15 +3529,15 @@
         <w:rPr>
           <w:b/>
         </w:rPr>
-        <w:t>4. Frame 11436, Sperm #6</w:t>
+        <w:t>4. Frame 3813, Sperm #6</w:t>
       </w:r>
       <w:r>
         <w:br/>
-        <w:t xml:space="preserve">   YOLOv8: Combined_Anomaly (80.9%)</w:t>
+        <w:t xml:space="preserve">   YOLOv8: Normal (39.9%)</w:t>
       </w:r>
       <w:r>
         <w:br/>
-        <w:t xml:space="preserve">   EfficientNet: Midpiece_Anomaly (46.8%)</w:t>
+        <w:t xml:space="preserve">   EfficientNet: Combined_Anomaly (95.4%)</w:t>
       </w:r>
       <w:r>
         <w:rPr>
@@ -2899,7 +3547,7 @@
         <w:t xml:space="preserve">   → Ensemble chose: </w:t>
       </w:r>
       <w:r>
-        <w:t>Combined_Anomaly (36.1%)</w:t>
+        <w:t>Combined_Anomaly (65.8%)</w:t>
       </w:r>
     </w:p>
     <w:p>
@@ -2907,15 +3555,15 @@
         <w:rPr>
           <w:b/>
         </w:rPr>
-        <w:t>5. Frame 11436, Sperm #7</w:t>
+        <w:t>5. Frame 3813, Sperm #7</w:t>
       </w:r>
       <w:r>
         <w:br/>
-        <w:t xml:space="preserve">   YOLOv8: Normal (63.2%)</w:t>
+        <w:t xml:space="preserve">   YOLOv8: Normal (48.9%)</w:t>
       </w:r>
       <w:r>
         <w:br/>
-        <w:t xml:space="preserve">   EfficientNet: Tail_Anomaly (96.9%)</w:t>
+        <w:t xml:space="preserve">   EfficientNet: Combined_Anomaly (99.3%)</w:t>
       </w:r>
       <w:r>
         <w:rPr>
@@ -2925,7 +3573,7 @@
         <w:t xml:space="preserve">   → Ensemble chose: </w:t>
       </w:r>
       <w:r>
-        <w:t>Tail_Anomaly (58.2%)</w:t>
+        <w:t>Combined_Anomaly (78.4%)</w:t>
       </w:r>
     </w:p>
     <w:p>
@@ -2933,15 +3581,15 @@
         <w:rPr>
           <w:b/>
         </w:rPr>
-        <w:t>6. Frame 11436, Sperm #8</w:t>
+        <w:t>6. Frame 3813, Sperm #8</w:t>
       </w:r>
       <w:r>
         <w:br/>
-        <w:t xml:space="preserve">   YOLOv8: Normal (87.3%)</w:t>
+        <w:t xml:space="preserve">   YOLOv8: Head_Anomaly (39.2%)</w:t>
       </w:r>
       <w:r>
         <w:br/>
-        <w:t xml:space="preserve">   EfficientNet: Combined_Anomaly (36.6%)</w:t>
+        <w:t xml:space="preserve">   EfficientNet: Normal (95.1%)</w:t>
       </w:r>
       <w:r>
         <w:rPr>
@@ -2951,7 +3599,7 @@
         <w:t xml:space="preserve">   → Ensemble chose: </w:t>
       </w:r>
       <w:r>
-        <w:t>Normal (52.0%)</w:t>
+        <w:t>Normal (71.3%)</w:t>
       </w:r>
     </w:p>
     <w:p>
@@ -2959,15 +3607,15 @@
         <w:rPr>
           <w:b/>
         </w:rPr>
-        <w:t>7. Frame 11436, Sperm #10</w:t>
+        <w:t>7. Frame 3813, Sperm #9</w:t>
       </w:r>
       <w:r>
         <w:br/>
-        <w:t xml:space="preserve">   YOLOv8: Head_Anomaly (79.1%)</w:t>
+        <w:t xml:space="preserve">   YOLOv8: Normal (56.3%)</w:t>
       </w:r>
       <w:r>
         <w:br/>
-        <w:t xml:space="preserve">   EfficientNet: Tail_Anomaly (84.4%)</w:t>
+        <w:t xml:space="preserve">   EfficientNet: Combined_Anomaly (65.5%)</w:t>
       </w:r>
       <w:r>
         <w:rPr>
@@ -2977,7 +3625,7 @@
         <w:t xml:space="preserve">   → Ensemble chose: </w:t>
       </w:r>
       <w:r>
-        <w:t>Tail_Anomaly (58.5%)</w:t>
+        <w:t>Combined_Anomaly (49.0%)</w:t>
       </w:r>
     </w:p>
     <w:p>
@@ -2985,15 +3633,15 @@
         <w:rPr>
           <w:b/>
         </w:rPr>
-        <w:t>8. Frame 11436, Sperm #11</w:t>
+        <w:t>8. Frame 3813, Sperm #10</w:t>
       </w:r>
       <w:r>
         <w:br/>
-        <w:t xml:space="preserve">   YOLOv8: Normal (74.1%)</w:t>
+        <w:t xml:space="preserve">   YOLOv8: Tail_Anomaly (82.7%)</w:t>
       </w:r>
       <w:r>
         <w:br/>
-        <w:t xml:space="preserve">   EfficientNet: Midpiece_Anomaly (34.4%)</w:t>
+        <w:t xml:space="preserve">   EfficientNet: Combined_Anomaly (99.6%)</w:t>
       </w:r>
       <w:r>
         <w:rPr>
@@ -3003,7 +3651,7 @@
         <w:t xml:space="preserve">   → Ensemble chose: </w:t>
       </w:r>
       <w:r>
-        <w:t>Normal (49.6%)</w:t>
+        <w:t>Combined_Anomaly (63.2%)</w:t>
       </w:r>
     </w:p>
     <w:p>
@@ -3011,15 +3659,15 @@
         <w:rPr>
           <w:b/>
         </w:rPr>
-        <w:t>9. Frame 11436, Sperm #12</w:t>
+        <w:t>9. Frame 3813, Sperm #11</w:t>
       </w:r>
       <w:r>
         <w:br/>
-        <w:t xml:space="preserve">   YOLOv8: Combined_Anomaly (90.2%)</w:t>
+        <w:t xml:space="preserve">   YOLOv8: Normal (87.2%)</w:t>
       </w:r>
       <w:r>
         <w:br/>
-        <w:t xml:space="preserve">   EfficientNet: Tail_Anomaly (47.8%)</w:t>
+        <w:t xml:space="preserve">   EfficientNet: Combined_Anomaly (59.3%)</w:t>
       </w:r>
       <w:r>
         <w:rPr>
@@ -3029,7 +3677,7 @@
         <w:t xml:space="preserve">   → Ensemble chose: </w:t>
       </w:r>
       <w:r>
-        <w:t>Combined_Anomaly (59.3%)</w:t>
+        <w:t>Combined_Anomaly (39.9%)</w:t>
       </w:r>
     </w:p>
     <w:p>
@@ -3037,15 +3685,15 @@
         <w:rPr>
           <w:b/>
         </w:rPr>
-        <w:t>10. Frame 11436, Sperm #15</w:t>
+        <w:t>10. Frame 3813, Sperm #13</w:t>
       </w:r>
       <w:r>
         <w:br/>
-        <w:t xml:space="preserve">   YOLOv8: Head_Anomaly (78.8%)</w:t>
+        <w:t xml:space="preserve">   YOLOv8: Combined_Anomaly (42.8%)</w:t>
       </w:r>
       <w:r>
         <w:br/>
-        <w:t xml:space="preserve">   EfficientNet: Tail_Anomaly (97.1%)</w:t>
+        <w:t xml:space="preserve">   EfficientNet: Head_Anomaly (57.8%)</w:t>
       </w:r>
       <w:r>
         <w:rPr>
@@ -3055,7 +3703,7 @@
         <w:t xml:space="preserve">   → Ensemble chose: </w:t>
       </w:r>
       <w:r>
-        <w:t>Tail_Anomaly (58.6%)</w:t>
+        <w:t>Head_Anomaly (48.2%)</w:t>
       </w:r>
     </w:p>
     <w:p>
@@ -3063,15 +3711,15 @@
         <w:rPr>
           <w:b/>
         </w:rPr>
-        <w:t>11. Frame 13154, Sperm #2</w:t>
+        <w:t>11. Frame 3813, Sperm #14</w:t>
       </w:r>
       <w:r>
         <w:br/>
-        <w:t xml:space="preserve">   YOLOv8: Head_Anomaly (77.9%)</w:t>
+        <w:t xml:space="preserve">   YOLOv8: Tail_Anomaly (87.7%)</w:t>
       </w:r>
       <w:r>
         <w:br/>
-        <w:t xml:space="preserve">   EfficientNet: Combined_Anomaly (30.4%)</w:t>
+        <w:t xml:space="preserve">   EfficientNet: Combined_Anomaly (75.8%)</w:t>
       </w:r>
       <w:r>
         <w:rPr>
@@ -3081,7 +3729,7 @@
         <w:t xml:space="preserve">   → Ensemble chose: </w:t>
       </w:r>
       <w:r>
-        <w:t>Head_Anomaly (48.8%)</w:t>
+        <w:t>Combined_Anomaly (47.5%)</w:t>
       </w:r>
     </w:p>
     <w:p>
@@ -3089,15 +3737,15 @@
         <w:rPr>
           <w:b/>
         </w:rPr>
-        <w:t>12. Frame 13154, Sperm #3</w:t>
+        <w:t>12. Frame 3813, Sperm #15</w:t>
       </w:r>
       <w:r>
         <w:br/>
-        <w:t xml:space="preserve">   YOLOv8: Head_Anomaly (45.7%)</w:t>
+        <w:t xml:space="preserve">   YOLOv8: Normal (57.7%)</w:t>
       </w:r>
       <w:r>
         <w:br/>
-        <w:t xml:space="preserve">   EfficientNet: Combined_Anomaly (80.2%)</w:t>
+        <w:t xml:space="preserve">   EfficientNet: Combined_Anomaly (47.1%)</w:t>
       </w:r>
       <w:r>
         <w:rPr>
@@ -3107,7 +3755,7 @@
         <w:t xml:space="preserve">   → Ensemble chose: </w:t>
       </w:r>
       <w:r>
-        <w:t>Combined_Anomaly (63.0%)</w:t>
+        <w:t>Combined_Anomaly (43.0%)</w:t>
       </w:r>
     </w:p>
     <w:p>
@@ -3115,15 +3763,15 @@
         <w:rPr>
           <w:b/>
         </w:rPr>
-        <w:t>13. Frame 13154, Sperm #4</w:t>
+        <w:t>13. Frame 14431, Sperm #1</w:t>
       </w:r>
       <w:r>
         <w:br/>
-        <w:t xml:space="preserve">   YOLOv8: Head_Anomaly (71.2%)</w:t>
+        <w:t xml:space="preserve">   YOLOv8: Normal (39.0%)</w:t>
       </w:r>
       <w:r>
         <w:br/>
-        <w:t xml:space="preserve">   EfficientNet: Midpiece_Anomaly (77.4%)</w:t>
+        <w:t xml:space="preserve">   EfficientNet: Combined_Anomaly (92.3%)</w:t>
       </w:r>
       <w:r>
         <w:rPr>
@@ -3133,7 +3781,7 @@
         <w:t xml:space="preserve">   → Ensemble chose: </w:t>
       </w:r>
       <w:r>
-        <w:t>Midpiece_Anomaly (46.4%)</w:t>
+        <w:t>Combined_Anomaly (68.6%)</w:t>
       </w:r>
     </w:p>
     <w:p>
@@ -3141,15 +3789,15 @@
         <w:rPr>
           <w:b/>
         </w:rPr>
-        <w:t>14. Frame 13154, Sperm #5</w:t>
+        <w:t>14. Frame 14431, Sperm #4</w:t>
       </w:r>
       <w:r>
         <w:br/>
-        <w:t xml:space="preserve">   YOLOv8: Normal (99.0%)</w:t>
+        <w:t xml:space="preserve">   YOLOv8: Normal (87.3%)</w:t>
       </w:r>
       <w:r>
         <w:br/>
-        <w:t xml:space="preserve">   EfficientNet: Tail_Anomaly (58.6%)</w:t>
+        <w:t xml:space="preserve">   EfficientNet: Head_Anomaly (70.1%)</w:t>
       </w:r>
       <w:r>
         <w:rPr>
@@ -3159,7 +3807,7 @@
         <w:t xml:space="preserve">   → Ensemble chose: </w:t>
       </w:r>
       <w:r>
-        <w:t>Normal (40.5%)</w:t>
+        <w:t>Head_Anomaly (42.2%)</w:t>
       </w:r>
     </w:p>
     <w:p>
@@ -3167,15 +3815,15 @@
         <w:rPr>
           <w:b/>
         </w:rPr>
-        <w:t>15. Frame 13154, Sperm #8</w:t>
+        <w:t>15. Frame 14431, Sperm #5</w:t>
       </w:r>
       <w:r>
         <w:br/>
-        <w:t xml:space="preserve">   YOLOv8: Tail_Anomaly (85.3%)</w:t>
+        <w:t xml:space="preserve">   YOLOv8: Tail_Anomaly (75.5%)</w:t>
       </w:r>
       <w:r>
         <w:br/>
-        <w:t xml:space="preserve">   EfficientNet: Combined_Anomaly (54.8%)</w:t>
+        <w:t xml:space="preserve">   EfficientNet: Combined_Anomaly (72.4%)</w:t>
       </w:r>
       <w:r>
         <w:rPr>
@@ -3185,7 +3833,7 @@
         <w:t xml:space="preserve">   → Ensemble chose: </w:t>
       </w:r>
       <w:r>
-        <w:t>Tail_Anomaly (34.9%)</w:t>
+        <w:t>Combined_Anomaly (46.7%)</w:t>
       </w:r>
     </w:p>
     <w:p>
@@ -3193,15 +3841,15 @@
         <w:rPr>
           <w:b/>
         </w:rPr>
-        <w:t>16. Frame 13154, Sperm #9</w:t>
+        <w:t>16. Frame 14431, Sperm #6</w:t>
       </w:r>
       <w:r>
         <w:br/>
-        <w:t xml:space="preserve">   YOLOv8: Combined_Anomaly (73.3%)</w:t>
+        <w:t xml:space="preserve">   YOLOv8: Normal (44.8%)</w:t>
       </w:r>
       <w:r>
         <w:br/>
-        <w:t xml:space="preserve">   EfficientNet: Tail_Anomaly (95.3%)</w:t>
+        <w:t xml:space="preserve">   EfficientNet: Combined_Anomaly (90.8%)</w:t>
       </w:r>
       <w:r>
         <w:rPr>
@@ -3211,7 +3859,7 @@
         <w:t xml:space="preserve">   → Ensemble chose: </w:t>
       </w:r>
       <w:r>
-        <w:t>Tail_Anomaly (57.6%)</w:t>
+        <w:t>Combined_Anomaly (67.0%)</w:t>
       </w:r>
     </w:p>
     <w:p>
@@ -3219,15 +3867,15 @@
         <w:rPr>
           <w:b/>
         </w:rPr>
-        <w:t>17. Frame 13154, Sperm #10</w:t>
+        <w:t>17. Frame 14431, Sperm #7</w:t>
       </w:r>
       <w:r>
         <w:br/>
-        <w:t xml:space="preserve">   YOLOv8: Head_Anomaly (70.7%)</w:t>
+        <w:t xml:space="preserve">   YOLOv8: Normal (43.6%)</w:t>
       </w:r>
       <w:r>
         <w:br/>
-        <w:t xml:space="preserve">   EfficientNet: Tail_Anomaly (61.0%)</w:t>
+        <w:t xml:space="preserve">   EfficientNet: Combined_Anomaly (61.8%)</w:t>
       </w:r>
       <w:r>
         <w:rPr>
@@ -3237,7 +3885,7 @@
         <w:t xml:space="preserve">   → Ensemble chose: </w:t>
       </w:r>
       <w:r>
-        <w:t>Tail_Anomaly (36.7%)</w:t>
+        <w:t>Combined_Anomaly (49.0%)</w:t>
       </w:r>
     </w:p>
     <w:p>
@@ -3245,15 +3893,15 @@
         <w:rPr>
           <w:b/>
         </w:rPr>
-        <w:t>18. Frame 13154, Sperm #11</w:t>
+        <w:t>18. Frame 14431, Sperm #8</w:t>
       </w:r>
       <w:r>
         <w:br/>
-        <w:t xml:space="preserve">   YOLOv8: Normal (73.3%)</w:t>
+        <w:t xml:space="preserve">   YOLOv8: Head_Anomaly (39.5%)</w:t>
       </w:r>
       <w:r>
         <w:br/>
-        <w:t xml:space="preserve">   EfficientNet: Head_Anomaly (59.0%)</w:t>
+        <w:t xml:space="preserve">   EfficientNet: Combined_Anomaly (72.2%)</w:t>
       </w:r>
       <w:r>
         <w:rPr>
@@ -3263,7 +3911,7 @@
         <w:t xml:space="preserve">   → Ensemble chose: </w:t>
       </w:r>
       <w:r>
-        <w:t>Head_Anomaly (35.4%)</w:t>
+        <w:t>Combined_Anomaly (51.1%)</w:t>
       </w:r>
     </w:p>
     <w:p>
@@ -3271,15 +3919,15 @@
         <w:rPr>
           <w:b/>
         </w:rPr>
-        <w:t>19. Frame 13154, Sperm #12</w:t>
+        <w:t>19. Frame 14431, Sperm #9</w:t>
       </w:r>
       <w:r>
         <w:br/>
-        <w:t xml:space="preserve">   YOLOv8: Normal (99.0%)</w:t>
+        <w:t xml:space="preserve">   YOLOv8: Normal (42.3%)</w:t>
       </w:r>
       <w:r>
         <w:br/>
-        <w:t xml:space="preserve">   EfficientNet: Head_Anomaly (52.6%)</w:t>
+        <w:t xml:space="preserve">   EfficientNet: Head_Anomaly (48.1%)</w:t>
       </w:r>
       <w:r>
         <w:rPr>
@@ -3289,7 +3937,7 @@
         <w:t xml:space="preserve">   → Ensemble chose: </w:t>
       </w:r>
       <w:r>
-        <w:t>Normal (50.5%)</w:t>
+        <w:t>Head_Anomaly (44.4%)</w:t>
       </w:r>
     </w:p>
     <w:p>
@@ -3297,15 +3945,15 @@
         <w:rPr>
           <w:b/>
         </w:rPr>
-        <w:t>20. Frame 13154, Sperm #13</w:t>
+        <w:t>20. Frame 14431, Sperm #10</w:t>
       </w:r>
       <w:r>
         <w:br/>
-        <w:t xml:space="preserve">   YOLOv8: Combined_Anomaly (97.9%)</w:t>
+        <w:t xml:space="preserve">   YOLOv8: Normal (51.9%)</w:t>
       </w:r>
       <w:r>
         <w:br/>
-        <w:t xml:space="preserve">   EfficientNet: Tail_Anomaly (58.4%)</w:t>
+        <w:t xml:space="preserve">   EfficientNet: Combined_Anomaly (85.1%)</w:t>
       </w:r>
       <w:r>
         <w:rPr>
@@ -3315,7 +3963,7 @@
         <w:t xml:space="preserve">   → Ensemble chose: </w:t>
       </w:r>
       <w:r>
-        <w:t>Combined_Anomaly (60.5%)</w:t>
+        <w:t>Combined_Anomaly (57.8%)</w:t>
       </w:r>
     </w:p>
     <w:p>
@@ -3323,15 +3971,15 @@
         <w:rPr>
           <w:b/>
         </w:rPr>
-        <w:t>21. Frame 13154, Sperm #14</w:t>
+        <w:t>21. Frame 14431, Sperm #11</w:t>
       </w:r>
       <w:r>
         <w:br/>
-        <w:t xml:space="preserve">   YOLOv8: Combined_Anomaly (99.5%)</w:t>
+        <w:t xml:space="preserve">   YOLOv8: Normal (86.2%)</w:t>
       </w:r>
       <w:r>
         <w:br/>
-        <w:t xml:space="preserve">   EfficientNet: Tail_Anomaly (95.9%)</w:t>
+        <w:t xml:space="preserve">   EfficientNet: Combined_Anomaly (74.9%)</w:t>
       </w:r>
       <w:r>
         <w:rPr>
@@ -3341,7 +3989,7 @@
         <w:t xml:space="preserve">   → Ensemble chose: </w:t>
       </w:r>
       <w:r>
-        <w:t>Tail_Anomaly (57.5%)</w:t>
+        <w:t>Combined_Anomaly (48.7%)</w:t>
       </w:r>
     </w:p>
     <w:p>
@@ -3349,15 +3997,15 @@
         <w:rPr>
           <w:b/>
         </w:rPr>
-        <w:t>22. Frame 13154, Sperm #15</w:t>
+        <w:t>22. Frame 14431, Sperm #12</w:t>
       </w:r>
       <w:r>
         <w:br/>
-        <w:t xml:space="preserve">   YOLOv8: Combined_Anomaly (73.9%)</w:t>
+        <w:t xml:space="preserve">   YOLOv8: Normal (39.1%)</w:t>
       </w:r>
       <w:r>
         <w:br/>
-        <w:t xml:space="preserve">   EfficientNet: Tail_Anomaly (77.3%)</w:t>
+        <w:t xml:space="preserve">   EfficientNet: Combined_Anomaly (70.6%)</w:t>
       </w:r>
       <w:r>
         <w:rPr>
@@ -3367,7 +4015,163 @@
         <w:t xml:space="preserve">   → Ensemble chose: </w:t>
       </w:r>
       <w:r>
-        <w:t>Tail_Anomaly (46.7%)</w:t>
+        <w:t>Combined_Anomaly (52.8%)</w:t>
+      </w:r>
+    </w:p>
+    <w:p>
+      <w:r>
+        <w:rPr>
+          <w:b/>
+        </w:rPr>
+        <w:t>23. Frame 14431, Sperm #13</w:t>
+      </w:r>
+      <w:r>
+        <w:br/>
+        <w:t xml:space="preserve">   YOLOv8: Head_Anomaly (34.2%)</w:t>
+      </w:r>
+      <w:r>
+        <w:br/>
+        <w:t xml:space="preserve">   EfficientNet: Combined_Anomaly (84.1%)</w:t>
+      </w:r>
+      <w:r>
+        <w:rPr>
+          <w:b/>
+        </w:rPr>
+        <w:br/>
+        <w:t xml:space="preserve">   → Ensemble chose: </w:t>
+      </w:r>
+      <w:r>
+        <w:t>Combined_Anomaly (58.8%)</w:t>
+      </w:r>
+    </w:p>
+    <w:p>
+      <w:r>
+        <w:rPr>
+          <w:b/>
+        </w:rPr>
+        <w:t>24. Frame 14431, Sperm #14</w:t>
+      </w:r>
+      <w:r>
+        <w:br/>
+        <w:t xml:space="preserve">   YOLOv8: Head_Anomaly (42.9%)</w:t>
+      </w:r>
+      <w:r>
+        <w:br/>
+        <w:t xml:space="preserve">   EfficientNet: Combined_Anomaly (83.1%)</w:t>
+      </w:r>
+      <w:r>
+        <w:rPr>
+          <w:b/>
+        </w:rPr>
+        <w:br/>
+        <w:t xml:space="preserve">   → Ensemble chose: </w:t>
+      </w:r>
+      <w:r>
+        <w:t>Combined_Anomaly (59.4%)</w:t>
+      </w:r>
+    </w:p>
+    <w:p>
+      <w:r>
+        <w:rPr>
+          <w:b/>
+        </w:rPr>
+        <w:t>25. Frame 14431, Sperm #17</w:t>
+      </w:r>
+      <w:r>
+        <w:br/>
+        <w:t xml:space="preserve">   YOLOv8: Normal (91.9%)</w:t>
+      </w:r>
+      <w:r>
+        <w:br/>
+        <w:t xml:space="preserve">   EfficientNet: Combined_Anomaly (95.8%)</w:t>
+      </w:r>
+      <w:r>
+        <w:rPr>
+          <w:b/>
+        </w:rPr>
+        <w:br/>
+        <w:t xml:space="preserve">   → Ensemble chose: </w:t>
+      </w:r>
+      <w:r>
+        <w:t>Combined_Anomaly (60.0%)</w:t>
+      </w:r>
+    </w:p>
+    <w:p>
+      <w:r>
+        <w:rPr>
+          <w:b/>
+        </w:rPr>
+        <w:t>26. Frame 14431, Sperm #19</w:t>
+      </w:r>
+      <w:r>
+        <w:br/>
+        <w:t xml:space="preserve">   YOLOv8: Normal (55.8%)</w:t>
+      </w:r>
+      <w:r>
+        <w:br/>
+        <w:t xml:space="preserve">   EfficientNet: Head_Anomaly (44.7%)</w:t>
+      </w:r>
+      <w:r>
+        <w:rPr>
+          <w:b/>
+        </w:rPr>
+        <w:br/>
+        <w:t xml:space="preserve">   → Ensemble chose: </w:t>
+      </w:r>
+      <w:r>
+        <w:t>Head_Anomaly (38.6%)</w:t>
+      </w:r>
+    </w:p>
+    <w:p>
+      <w:r>
+        <w:rPr>
+          <w:b/>
+        </w:rPr>
+        <w:t>27. Frame 14431, Sperm #21</w:t>
+      </w:r>
+      <w:r>
+        <w:br/>
+        <w:t xml:space="preserve">   YOLOv8: Normal (71.1%)</w:t>
+      </w:r>
+      <w:r>
+        <w:br/>
+        <w:t xml:space="preserve">   EfficientNet: Head_Anomaly (95.1%)</w:t>
+      </w:r>
+      <w:r>
+        <w:rPr>
+          <w:b/>
+        </w:rPr>
+        <w:br/>
+        <w:t xml:space="preserve">   → Ensemble chose: </w:t>
+      </w:r>
+      <w:r>
+        <w:t>Head_Anomaly (58.3%)</w:t>
+      </w:r>
+    </w:p>
+    <w:p>
+      <w:r>
+        <w:rPr>
+          <w:b/>
+        </w:rPr>
+        <w:t>28. Frame 14431, Sperm #22</w:t>
+      </w:r>
+      <w:r>
+        <w:br/>
+        <w:t xml:space="preserve">   YOLOv8: Tail_Anomaly (48.2%)</w:t>
+      </w:r>
+      <w:r>
+        <w:br/>
+        <w:t xml:space="preserve">   EfficientNet: Combined_Anomaly (92.2%)</w:t>
+      </w:r>
+      <w:r>
+        <w:rPr>
+          <w:b/>
+        </w:rPr>
+        <w:br/>
+        <w:t xml:space="preserve">   → Ensemble chose: </w:t>
+      </w:r>
+      <w:r>
+        <w:t>Combined_Anomaly (61.6%)</w:t>
       </w:r>
     </w:p>
     <w:p>
@@ -3380,17 +4184,17 @@
     </w:p>
     <w:p>
       <w:r>
-        <w:t>YOLOv8 ↔ EfficientNet agreement: 9/31 (29.0%)</w:t>
+        <w:t>YOLOv8 ↔ EfficientNet agreement: 12/40 (30.0%)</w:t>
       </w:r>
     </w:p>
     <w:p>
       <w:r>
-        <w:t>Ensemble sided with YOLOv8: 20/31 (64.5%)</w:t>
+        <w:t>Ensemble sided with YOLOv8: 12/40 (30.0%)</w:t>
       </w:r>
     </w:p>
     <w:p>
       <w:r>
-        <w:t>Ensemble sided with EfficientNet: 20/31 (64.5%)</w:t>
+        <w:t>Ensemble sided with EfficientNet: 40/40 (100.0%)</w:t>
       </w:r>
     </w:p>
     <w:sectPr>

</xml_diff>